<commit_message>
docs: secciones 8 del documento rellenadas
</commit_message>
<xml_diff>
--- a/docs/UT_7_2024_2025 (1).docx
+++ b/docs/UT_7_2024_2025 (1).docx
@@ -26383,15 +26383,2601 @@
     <w:p>
       <w:pPr>
         <w:rPr>
+          <w:b/>
+          <w:bCs/>
+          <w:color w:val="0F0D29" w:themeColor="text1"/>
+        </w:rPr>
+      </w:pPr>
+      <w:r>
+        <w:rPr>
+          <w:b/>
+          <w:bCs/>
+          <w:color w:val="0F0D29" w:themeColor="text1"/>
+        </w:rPr>
+        <w:t>Menú Principal</w:t>
+      </w:r>
+    </w:p>
+    <w:tbl>
+      <w:tblPr>
+        <w:tblStyle w:val="Tablaconcuadrcula"/>
+        <w:tblW w:w="0" w:type="auto"/>
+        <w:tblLook w:val="04A0" w:firstRow="1" w:lastRow="0" w:firstColumn="1" w:lastColumn="0" w:noHBand="0" w:noVBand="1"/>
+      </w:tblPr>
+      <w:tblGrid>
+        <w:gridCol w:w="2004"/>
+        <w:gridCol w:w="2005"/>
+        <w:gridCol w:w="2005"/>
+        <w:gridCol w:w="2005"/>
+        <w:gridCol w:w="2005"/>
+      </w:tblGrid>
+      <w:tr>
+        <w:tc>
+          <w:tcPr>
+            <w:tcW w:w="2004" w:type="dxa"/>
+            <w:vAlign w:val="center"/>
+          </w:tcPr>
+          <w:p>
+            <w:pPr>
+              <w:rPr>
+                <w:color w:val="FF0000"/>
+              </w:rPr>
+            </w:pPr>
+            <w:r>
+              <w:rPr>
+                <w:b/>
+                <w:bCs/>
+              </w:rPr>
+              <w:t>Descripción</w:t>
+            </w:r>
+          </w:p>
+        </w:tc>
+        <w:tc>
+          <w:tcPr>
+            <w:tcW w:w="2005" w:type="dxa"/>
+            <w:vAlign w:val="center"/>
+          </w:tcPr>
+          <w:p>
+            <w:pPr>
+              <w:rPr>
+                <w:color w:val="FF0000"/>
+              </w:rPr>
+            </w:pPr>
+            <w:r>
+              <w:rPr>
+                <w:b/>
+                <w:bCs/>
+              </w:rPr>
+              <w:t>Parámetros</w:t>
+            </w:r>
+          </w:p>
+        </w:tc>
+        <w:tc>
+          <w:tcPr>
+            <w:tcW w:w="2005" w:type="dxa"/>
+            <w:vAlign w:val="center"/>
+          </w:tcPr>
+          <w:p>
+            <w:pPr>
+              <w:rPr>
+                <w:color w:val="FF0000"/>
+              </w:rPr>
+            </w:pPr>
+            <w:r>
+              <w:rPr>
+                <w:b/>
+                <w:bCs/>
+              </w:rPr>
+              <w:t>Esperado</w:t>
+            </w:r>
+          </w:p>
+        </w:tc>
+        <w:tc>
+          <w:tcPr>
+            <w:tcW w:w="2005" w:type="dxa"/>
+            <w:vAlign w:val="center"/>
+          </w:tcPr>
+          <w:p>
+            <w:pPr>
+              <w:rPr>
+                <w:color w:val="FF0000"/>
+              </w:rPr>
+            </w:pPr>
+            <w:r>
+              <w:rPr>
+                <w:b/>
+                <w:bCs/>
+              </w:rPr>
+              <w:t>Obtenido</w:t>
+            </w:r>
+          </w:p>
+        </w:tc>
+        <w:tc>
+          <w:tcPr>
+            <w:tcW w:w="2005" w:type="dxa"/>
+            <w:vAlign w:val="center"/>
+          </w:tcPr>
+          <w:p>
+            <w:pPr>
+              <w:rPr>
+                <w:color w:val="FF0000"/>
+              </w:rPr>
+            </w:pPr>
+            <w:r>
+              <w:rPr>
+                <w:b/>
+                <w:bCs/>
+              </w:rPr>
+              <w:t>Resultado</w:t>
+            </w:r>
+          </w:p>
+        </w:tc>
+      </w:tr>
+      <w:tr>
+        <w:tc>
+          <w:tcPr>
+            <w:tcW w:w="2004" w:type="dxa"/>
+            <w:vAlign w:val="center"/>
+          </w:tcPr>
+          <w:p>
+            <w:pPr>
+              <w:rPr>
+                <w:color w:val="FF0000"/>
+              </w:rPr>
+            </w:pPr>
+            <w:r>
+              <w:t>Introducir opción válida</w:t>
+            </w:r>
+          </w:p>
+        </w:tc>
+        <w:tc>
+          <w:tcPr>
+            <w:tcW w:w="2005" w:type="dxa"/>
+            <w:vAlign w:val="center"/>
+          </w:tcPr>
+          <w:p>
+            <w:pPr>
+              <w:rPr>
+                <w:color w:val="FF0000"/>
+              </w:rPr>
+            </w:pPr>
+            <w:r>
+              <w:t>Opción 1</w:t>
+            </w:r>
+          </w:p>
+        </w:tc>
+        <w:tc>
+          <w:tcPr>
+            <w:tcW w:w="2005" w:type="dxa"/>
+            <w:vAlign w:val="center"/>
+          </w:tcPr>
+          <w:p>
+            <w:pPr>
+              <w:rPr>
+                <w:color w:val="FF0000"/>
+              </w:rPr>
+            </w:pPr>
+            <w:r>
+              <w:t>Accede a Carga de datos</w:t>
+            </w:r>
+          </w:p>
+        </w:tc>
+        <w:tc>
+          <w:tcPr>
+            <w:tcW w:w="2005" w:type="dxa"/>
+            <w:vAlign w:val="center"/>
+          </w:tcPr>
+          <w:p>
+            <w:pPr>
+              <w:rPr>
+                <w:color w:val="FF0000"/>
+              </w:rPr>
+            </w:pPr>
+            <w:r>
+              <w:t>Accede a Carga de datos</w:t>
+            </w:r>
+          </w:p>
+        </w:tc>
+        <w:tc>
+          <w:tcPr>
+            <w:tcW w:w="2005" w:type="dxa"/>
+            <w:vAlign w:val="center"/>
+          </w:tcPr>
+          <w:p>
+            <w:pPr>
+              <w:rPr>
+                <w:color w:val="FF0000"/>
+              </w:rPr>
+            </w:pPr>
+            <w:r>
+              <w:t>OK</w:t>
+            </w:r>
+          </w:p>
+        </w:tc>
+      </w:tr>
+      <w:tr>
+        <w:tc>
+          <w:tcPr>
+            <w:tcW w:w="2004" w:type="dxa"/>
+            <w:vAlign w:val="center"/>
+          </w:tcPr>
+          <w:p>
+            <w:pPr>
+              <w:rPr>
+                <w:color w:val="FF0000"/>
+              </w:rPr>
+            </w:pPr>
+            <w:r>
+              <w:t>Introducir opción válida</w:t>
+            </w:r>
+          </w:p>
+        </w:tc>
+        <w:tc>
+          <w:tcPr>
+            <w:tcW w:w="2005" w:type="dxa"/>
+            <w:vAlign w:val="center"/>
+          </w:tcPr>
+          <w:p>
+            <w:pPr>
+              <w:rPr>
+                <w:color w:val="FF0000"/>
+              </w:rPr>
+            </w:pPr>
+            <w:r>
+              <w:t>Opción 2</w:t>
+            </w:r>
+          </w:p>
+        </w:tc>
+        <w:tc>
+          <w:tcPr>
+            <w:tcW w:w="2005" w:type="dxa"/>
+            <w:vAlign w:val="center"/>
+          </w:tcPr>
+          <w:p>
+            <w:pPr>
+              <w:rPr>
+                <w:color w:val="FF0000"/>
+              </w:rPr>
+            </w:pPr>
+            <w:r>
+              <w:t>Accede a Gestión de alumnos</w:t>
+            </w:r>
+          </w:p>
+        </w:tc>
+        <w:tc>
+          <w:tcPr>
+            <w:tcW w:w="2005" w:type="dxa"/>
+            <w:vAlign w:val="center"/>
+          </w:tcPr>
+          <w:p>
+            <w:pPr>
+              <w:rPr>
+                <w:color w:val="FF0000"/>
+              </w:rPr>
+            </w:pPr>
+            <w:r>
+              <w:t>Accede a Gestión de alumnos</w:t>
+            </w:r>
+          </w:p>
+        </w:tc>
+        <w:tc>
+          <w:tcPr>
+            <w:tcW w:w="2005" w:type="dxa"/>
+            <w:vAlign w:val="center"/>
+          </w:tcPr>
+          <w:p>
+            <w:pPr>
+              <w:rPr>
+                <w:color w:val="FF0000"/>
+              </w:rPr>
+            </w:pPr>
+            <w:r>
+              <w:t>OK</w:t>
+            </w:r>
+          </w:p>
+        </w:tc>
+      </w:tr>
+      <w:tr>
+        <w:tc>
+          <w:tcPr>
+            <w:tcW w:w="2004" w:type="dxa"/>
+            <w:vAlign w:val="center"/>
+          </w:tcPr>
+          <w:p>
+            <w:pPr>
+              <w:rPr>
+                <w:color w:val="FF0000"/>
+              </w:rPr>
+            </w:pPr>
+            <w:r>
+              <w:t>Introducir opción inválida</w:t>
+            </w:r>
+          </w:p>
+        </w:tc>
+        <w:tc>
+          <w:tcPr>
+            <w:tcW w:w="2005" w:type="dxa"/>
+            <w:vAlign w:val="center"/>
+          </w:tcPr>
+          <w:p>
+            <w:pPr>
+              <w:rPr>
+                <w:color w:val="FF0000"/>
+              </w:rPr>
+            </w:pPr>
+            <w:r>
+              <w:t>Opción 9</w:t>
+            </w:r>
+          </w:p>
+        </w:tc>
+        <w:tc>
+          <w:tcPr>
+            <w:tcW w:w="2005" w:type="dxa"/>
+            <w:vAlign w:val="center"/>
+          </w:tcPr>
+          <w:p>
+            <w:pPr>
+              <w:rPr>
+                <w:color w:val="FF0000"/>
+              </w:rPr>
+            </w:pPr>
+            <w:r>
+              <w:t>Muestra error y repite menú</w:t>
+            </w:r>
+          </w:p>
+        </w:tc>
+        <w:tc>
+          <w:tcPr>
+            <w:tcW w:w="2005" w:type="dxa"/>
+            <w:vAlign w:val="center"/>
+          </w:tcPr>
+          <w:p>
+            <w:pPr>
+              <w:rPr>
+                <w:color w:val="FF0000"/>
+              </w:rPr>
+            </w:pPr>
+            <w:r>
+              <w:t>Muestra error y repite menú</w:t>
+            </w:r>
+          </w:p>
+        </w:tc>
+        <w:tc>
+          <w:tcPr>
+            <w:tcW w:w="2005" w:type="dxa"/>
+            <w:vAlign w:val="center"/>
+          </w:tcPr>
+          <w:p>
+            <w:pPr>
+              <w:rPr>
+                <w:color w:val="FF0000"/>
+              </w:rPr>
+            </w:pPr>
+            <w:r>
+              <w:t>OK</w:t>
+            </w:r>
+          </w:p>
+        </w:tc>
+      </w:tr>
+      <w:tr>
+        <w:tc>
+          <w:tcPr>
+            <w:tcW w:w="2004" w:type="dxa"/>
+            <w:vAlign w:val="center"/>
+          </w:tcPr>
+          <w:p>
+            <w:pPr>
+              <w:rPr>
+                <w:color w:val="FF0000"/>
+              </w:rPr>
+            </w:pPr>
+            <w:r>
+              <w:t>Introducir letra en vez de número</w:t>
+            </w:r>
+          </w:p>
+        </w:tc>
+        <w:tc>
+          <w:tcPr>
+            <w:tcW w:w="2005" w:type="dxa"/>
+            <w:vAlign w:val="center"/>
+          </w:tcPr>
+          <w:p>
+            <w:pPr>
+              <w:rPr>
+                <w:color w:val="FF0000"/>
+              </w:rPr>
+            </w:pPr>
+            <w:r>
+              <w:t>"a"</w:t>
+            </w:r>
+          </w:p>
+        </w:tc>
+        <w:tc>
+          <w:tcPr>
+            <w:tcW w:w="2005" w:type="dxa"/>
+            <w:vAlign w:val="center"/>
+          </w:tcPr>
+          <w:p>
+            <w:pPr>
+              <w:rPr>
+                <w:color w:val="FF0000"/>
+              </w:rPr>
+            </w:pPr>
+            <w:r>
+              <w:t>Muestra error y repite menú</w:t>
+            </w:r>
+          </w:p>
+        </w:tc>
+        <w:tc>
+          <w:tcPr>
+            <w:tcW w:w="2005" w:type="dxa"/>
+            <w:vAlign w:val="center"/>
+          </w:tcPr>
+          <w:p>
+            <w:pPr>
+              <w:rPr>
+                <w:color w:val="FF0000"/>
+              </w:rPr>
+            </w:pPr>
+            <w:r>
+              <w:t>Muestra error y repite menú</w:t>
+            </w:r>
+          </w:p>
+        </w:tc>
+        <w:tc>
+          <w:tcPr>
+            <w:tcW w:w="2005" w:type="dxa"/>
+            <w:vAlign w:val="center"/>
+          </w:tcPr>
+          <w:p>
+            <w:pPr>
+              <w:rPr>
+                <w:color w:val="FF0000"/>
+              </w:rPr>
+            </w:pPr>
+            <w:r>
+              <w:t>OK</w:t>
+            </w:r>
+          </w:p>
+        </w:tc>
+      </w:tr>
+      <w:tr>
+        <w:tc>
+          <w:tcPr>
+            <w:tcW w:w="2004" w:type="dxa"/>
+            <w:vAlign w:val="center"/>
+          </w:tcPr>
+          <w:p>
+            <w:pPr>
+              <w:rPr>
+                <w:color w:val="FF0000"/>
+              </w:rPr>
+            </w:pPr>
+            <w:r>
+              <w:t>Introducir opción 0</w:t>
+            </w:r>
+          </w:p>
+        </w:tc>
+        <w:tc>
+          <w:tcPr>
+            <w:tcW w:w="2005" w:type="dxa"/>
+            <w:vAlign w:val="center"/>
+          </w:tcPr>
+          <w:p>
+            <w:pPr>
+              <w:rPr>
+                <w:color w:val="FF0000"/>
+              </w:rPr>
+            </w:pPr>
+            <w:r>
+              <w:t>Opción 0</w:t>
+            </w:r>
+          </w:p>
+        </w:tc>
+        <w:tc>
+          <w:tcPr>
+            <w:tcW w:w="2005" w:type="dxa"/>
+            <w:vAlign w:val="center"/>
+          </w:tcPr>
+          <w:p>
+            <w:pPr>
+              <w:rPr>
+                <w:color w:val="FF0000"/>
+              </w:rPr>
+            </w:pPr>
+            <w:r>
+              <w:t>Sale de la aplicación</w:t>
+            </w:r>
+          </w:p>
+        </w:tc>
+        <w:tc>
+          <w:tcPr>
+            <w:tcW w:w="2005" w:type="dxa"/>
+            <w:vAlign w:val="center"/>
+          </w:tcPr>
+          <w:p>
+            <w:pPr>
+              <w:rPr>
+                <w:color w:val="FF0000"/>
+              </w:rPr>
+            </w:pPr>
+            <w:r>
+              <w:t>Sale de la aplicación</w:t>
+            </w:r>
+          </w:p>
+        </w:tc>
+        <w:tc>
+          <w:tcPr>
+            <w:tcW w:w="2005" w:type="dxa"/>
+            <w:vAlign w:val="center"/>
+          </w:tcPr>
+          <w:p>
+            <w:pPr>
+              <w:rPr>
+                <w:color w:val="FF0000"/>
+              </w:rPr>
+            </w:pPr>
+            <w:r>
+              <w:t>OK</w:t>
+            </w:r>
+          </w:p>
+        </w:tc>
+      </w:tr>
+    </w:tbl>
+    <w:p>
+      <w:pPr>
+        <w:rPr>
           <w:color w:val="FF0000"/>
         </w:rPr>
       </w:pPr>
-      <w:r>
+    </w:p>
+    <w:p>
+      <w:pPr>
+        <w:rPr>
+          <w:b/>
+          <w:bCs/>
+          <w:color w:val="0F0D29" w:themeColor="text1"/>
+        </w:rPr>
+      </w:pPr>
+      <w:r>
+        <w:rPr>
+          <w:b/>
+          <w:bCs/>
+          <w:color w:val="0F0D29" w:themeColor="text1"/>
+        </w:rPr>
+        <w:t>Carga de datos</w:t>
+      </w:r>
+    </w:p>
+    <w:tbl>
+      <w:tblPr>
+        <w:tblStyle w:val="Tablaconcuadrcula"/>
+        <w:tblW w:w="0" w:type="auto"/>
+        <w:tblLook w:val="04A0" w:firstRow="1" w:lastRow="0" w:firstColumn="1" w:lastColumn="0" w:noHBand="0" w:noVBand="1"/>
+      </w:tblPr>
+      <w:tblGrid>
+        <w:gridCol w:w="1670"/>
+        <w:gridCol w:w="1670"/>
+        <w:gridCol w:w="1671"/>
+        <w:gridCol w:w="1671"/>
+        <w:gridCol w:w="1671"/>
+        <w:gridCol w:w="1671"/>
+      </w:tblGrid>
+      <w:tr>
+        <w:tc>
+          <w:tcPr>
+            <w:tcW w:w="1670" w:type="dxa"/>
+            <w:vAlign w:val="center"/>
+          </w:tcPr>
+          <w:p>
+            <w:pPr>
+              <w:rPr>
+                <w:color w:val="FF0000"/>
+              </w:rPr>
+            </w:pPr>
+            <w:r>
+              <w:rPr>
+                <w:b/>
+                <w:bCs/>
+              </w:rPr>
+              <w:t>Descripción</w:t>
+            </w:r>
+          </w:p>
+        </w:tc>
+        <w:tc>
+          <w:tcPr>
+            <w:tcW w:w="1670" w:type="dxa"/>
+            <w:vAlign w:val="center"/>
+          </w:tcPr>
+          <w:p>
+            <w:pPr>
+              <w:rPr>
+                <w:color w:val="FF0000"/>
+              </w:rPr>
+            </w:pPr>
+            <w:r>
+              <w:rPr>
+                <w:b/>
+                <w:bCs/>
+              </w:rPr>
+              <w:t>Parámetros</w:t>
+            </w:r>
+          </w:p>
+        </w:tc>
+        <w:tc>
+          <w:tcPr>
+            <w:tcW w:w="1671" w:type="dxa"/>
+            <w:vAlign w:val="center"/>
+          </w:tcPr>
+          <w:p>
+            <w:pPr>
+              <w:rPr>
+                <w:color w:val="FF0000"/>
+              </w:rPr>
+            </w:pPr>
+            <w:r>
+              <w:rPr>
+                <w:b/>
+                <w:bCs/>
+              </w:rPr>
+              <w:t>Esperado</w:t>
+            </w:r>
+          </w:p>
+        </w:tc>
+        <w:tc>
+          <w:tcPr>
+            <w:tcW w:w="1671" w:type="dxa"/>
+            <w:vAlign w:val="center"/>
+          </w:tcPr>
+          <w:p>
+            <w:pPr>
+              <w:rPr>
+                <w:color w:val="FF0000"/>
+              </w:rPr>
+            </w:pPr>
+            <w:r>
+              <w:rPr>
+                <w:b/>
+                <w:bCs/>
+              </w:rPr>
+              <w:t>Obtenido</w:t>
+            </w:r>
+          </w:p>
+        </w:tc>
+        <w:tc>
+          <w:tcPr>
+            <w:tcW w:w="1671" w:type="dxa"/>
+            <w:vAlign w:val="center"/>
+          </w:tcPr>
+          <w:p>
+            <w:pPr>
+              <w:rPr>
+                <w:color w:val="FF0000"/>
+              </w:rPr>
+            </w:pPr>
+            <w:r>
+              <w:rPr>
+                <w:b/>
+                <w:bCs/>
+              </w:rPr>
+              <w:t>Resultado</w:t>
+            </w:r>
+          </w:p>
+        </w:tc>
+        <w:tc>
+          <w:tcPr>
+            <w:tcW w:w="1671" w:type="dxa"/>
+            <w:vAlign w:val="center"/>
+          </w:tcPr>
+          <w:p>
+            <w:pPr>
+              <w:rPr>
+                <w:color w:val="FF0000"/>
+              </w:rPr>
+            </w:pPr>
+            <w:r>
+              <w:rPr>
+                <w:b/>
+                <w:bCs/>
+              </w:rPr>
+              <w:t>Descripción</w:t>
+            </w:r>
+          </w:p>
+        </w:tc>
+      </w:tr>
+      <w:tr>
+        <w:tc>
+          <w:tcPr>
+            <w:tcW w:w="1670" w:type="dxa"/>
+            <w:vAlign w:val="center"/>
+          </w:tcPr>
+          <w:p>
+            <w:pPr>
+              <w:rPr>
+                <w:color w:val="FF0000"/>
+              </w:rPr>
+            </w:pPr>
+            <w:r>
+              <w:t>Cargar CSV correcto</w:t>
+            </w:r>
+          </w:p>
+        </w:tc>
+        <w:tc>
+          <w:tcPr>
+            <w:tcW w:w="1670" w:type="dxa"/>
+            <w:vAlign w:val="center"/>
+          </w:tcPr>
+          <w:p>
+            <w:pPr>
+              <w:rPr>
+                <w:color w:val="FF0000"/>
+              </w:rPr>
+            </w:pPr>
+            <w:r>
+              <w:t xml:space="preserve">Fichero válido de </w:t>
+            </w:r>
+            <w:proofErr w:type="spellStart"/>
+            <w:r>
+              <w:t>Delphos</w:t>
+            </w:r>
+            <w:proofErr w:type="spellEnd"/>
+          </w:p>
+        </w:tc>
+        <w:tc>
+          <w:tcPr>
+            <w:tcW w:w="1671" w:type="dxa"/>
+            <w:vAlign w:val="center"/>
+          </w:tcPr>
+          <w:p>
+            <w:pPr>
+              <w:rPr>
+                <w:color w:val="FF0000"/>
+              </w:rPr>
+            </w:pPr>
+            <w:r>
+              <w:t>Alumnos importados correctamente</w:t>
+            </w:r>
+          </w:p>
+        </w:tc>
+        <w:tc>
+          <w:tcPr>
+            <w:tcW w:w="1671" w:type="dxa"/>
+            <w:vAlign w:val="center"/>
+          </w:tcPr>
+          <w:p>
+            <w:pPr>
+              <w:rPr>
+                <w:color w:val="FF0000"/>
+              </w:rPr>
+            </w:pPr>
+            <w:r>
+              <w:t>Alumnos importados correctamente</w:t>
+            </w:r>
+          </w:p>
+        </w:tc>
+        <w:tc>
+          <w:tcPr>
+            <w:tcW w:w="1671" w:type="dxa"/>
+            <w:vAlign w:val="center"/>
+          </w:tcPr>
+          <w:p>
+            <w:pPr>
+              <w:rPr>
+                <w:color w:val="FF0000"/>
+              </w:rPr>
+            </w:pPr>
+            <w:r>
+              <w:t>OK</w:t>
+            </w:r>
+          </w:p>
+        </w:tc>
+        <w:tc>
+          <w:tcPr>
+            <w:tcW w:w="1671" w:type="dxa"/>
+            <w:vAlign w:val="center"/>
+          </w:tcPr>
+          <w:p>
+            <w:pPr>
+              <w:rPr>
+                <w:color w:val="FF0000"/>
+              </w:rPr>
+            </w:pPr>
+            <w:r>
+              <w:t>Cargar CSV correcto</w:t>
+            </w:r>
+          </w:p>
+        </w:tc>
+      </w:tr>
+      <w:tr>
+        <w:tc>
+          <w:tcPr>
+            <w:tcW w:w="1670" w:type="dxa"/>
+            <w:vAlign w:val="center"/>
+          </w:tcPr>
+          <w:p>
+            <w:pPr>
+              <w:rPr>
+                <w:color w:val="FF0000"/>
+              </w:rPr>
+            </w:pPr>
+            <w:r>
+              <w:t>Cargar CSV con formato incorrecto</w:t>
+            </w:r>
+          </w:p>
+        </w:tc>
+        <w:tc>
+          <w:tcPr>
+            <w:tcW w:w="1670" w:type="dxa"/>
+            <w:vAlign w:val="center"/>
+          </w:tcPr>
+          <w:p>
+            <w:pPr>
+              <w:rPr>
+                <w:color w:val="FF0000"/>
+              </w:rPr>
+            </w:pPr>
+            <w:r>
+              <w:t>Fichero mal formado</w:t>
+            </w:r>
+          </w:p>
+        </w:tc>
+        <w:tc>
+          <w:tcPr>
+            <w:tcW w:w="1671" w:type="dxa"/>
+            <w:vAlign w:val="center"/>
+          </w:tcPr>
+          <w:p>
+            <w:pPr>
+              <w:rPr>
+                <w:color w:val="FF0000"/>
+              </w:rPr>
+            </w:pPr>
+            <w:r>
+              <w:t>Muestra error de formato</w:t>
+            </w:r>
+          </w:p>
+        </w:tc>
+        <w:tc>
+          <w:tcPr>
+            <w:tcW w:w="1671" w:type="dxa"/>
+            <w:vAlign w:val="center"/>
+          </w:tcPr>
+          <w:p>
+            <w:pPr>
+              <w:rPr>
+                <w:color w:val="FF0000"/>
+              </w:rPr>
+            </w:pPr>
+            <w:r>
+              <w:t>Muestra error de formato</w:t>
+            </w:r>
+          </w:p>
+        </w:tc>
+        <w:tc>
+          <w:tcPr>
+            <w:tcW w:w="1671" w:type="dxa"/>
+            <w:vAlign w:val="center"/>
+          </w:tcPr>
+          <w:p>
+            <w:pPr>
+              <w:rPr>
+                <w:color w:val="FF0000"/>
+              </w:rPr>
+            </w:pPr>
+            <w:r>
+              <w:t>OK</w:t>
+            </w:r>
+          </w:p>
+        </w:tc>
+        <w:tc>
+          <w:tcPr>
+            <w:tcW w:w="1671" w:type="dxa"/>
+            <w:vAlign w:val="center"/>
+          </w:tcPr>
+          <w:p>
+            <w:pPr>
+              <w:rPr>
+                <w:color w:val="FF0000"/>
+              </w:rPr>
+            </w:pPr>
+            <w:r>
+              <w:t>Cargar CSV con formato incorrecto</w:t>
+            </w:r>
+          </w:p>
+        </w:tc>
+      </w:tr>
+      <w:tr>
+        <w:tc>
+          <w:tcPr>
+            <w:tcW w:w="1670" w:type="dxa"/>
+            <w:vAlign w:val="center"/>
+          </w:tcPr>
+          <w:p>
+            <w:pPr>
+              <w:rPr>
+                <w:color w:val="FF0000"/>
+              </w:rPr>
+            </w:pPr>
+            <w:r>
+              <w:t>Vaciar base de datos</w:t>
+            </w:r>
+          </w:p>
+        </w:tc>
+        <w:tc>
+          <w:tcPr>
+            <w:tcW w:w="1670" w:type="dxa"/>
+            <w:vAlign w:val="center"/>
+          </w:tcPr>
+          <w:p>
+            <w:pPr>
+              <w:rPr>
+                <w:color w:val="FF0000"/>
+              </w:rPr>
+            </w:pPr>
+            <w:r>
+              <w:t>Confirmar vaciado</w:t>
+            </w:r>
+          </w:p>
+        </w:tc>
+        <w:tc>
+          <w:tcPr>
+            <w:tcW w:w="1671" w:type="dxa"/>
+            <w:vAlign w:val="center"/>
+          </w:tcPr>
+          <w:p>
+            <w:pPr>
+              <w:rPr>
+                <w:color w:val="FF0000"/>
+              </w:rPr>
+            </w:pPr>
+            <w:r>
+              <w:t>Todas las tablas vacías</w:t>
+            </w:r>
+          </w:p>
+        </w:tc>
+        <w:tc>
+          <w:tcPr>
+            <w:tcW w:w="1671" w:type="dxa"/>
+            <w:vAlign w:val="center"/>
+          </w:tcPr>
+          <w:p>
+            <w:pPr>
+              <w:rPr>
+                <w:color w:val="FF0000"/>
+              </w:rPr>
+            </w:pPr>
+            <w:r>
+              <w:t>Todas las tablas vacías</w:t>
+            </w:r>
+          </w:p>
+        </w:tc>
+        <w:tc>
+          <w:tcPr>
+            <w:tcW w:w="1671" w:type="dxa"/>
+            <w:vAlign w:val="center"/>
+          </w:tcPr>
+          <w:p>
+            <w:pPr>
+              <w:rPr>
+                <w:color w:val="FF0000"/>
+              </w:rPr>
+            </w:pPr>
+            <w:r>
+              <w:t>OK</w:t>
+            </w:r>
+          </w:p>
+        </w:tc>
+        <w:tc>
+          <w:tcPr>
+            <w:tcW w:w="1671" w:type="dxa"/>
+            <w:vAlign w:val="center"/>
+          </w:tcPr>
+          <w:p>
+            <w:pPr>
+              <w:rPr>
+                <w:color w:val="FF0000"/>
+              </w:rPr>
+            </w:pPr>
+            <w:r>
+              <w:t>Vaciar base de datos</w:t>
+            </w:r>
+          </w:p>
+        </w:tc>
+      </w:tr>
+      <w:tr>
+        <w:tc>
+          <w:tcPr>
+            <w:tcW w:w="1670" w:type="dxa"/>
+            <w:vAlign w:val="center"/>
+          </w:tcPr>
+          <w:p>
+            <w:pPr>
+              <w:rPr>
+                <w:color w:val="FF0000"/>
+              </w:rPr>
+            </w:pPr>
+            <w:r>
+              <w:t>Vaciar base de datos</w:t>
+            </w:r>
+          </w:p>
+        </w:tc>
+        <w:tc>
+          <w:tcPr>
+            <w:tcW w:w="1670" w:type="dxa"/>
+            <w:vAlign w:val="center"/>
+          </w:tcPr>
+          <w:p>
+            <w:pPr>
+              <w:rPr>
+                <w:color w:val="FF0000"/>
+              </w:rPr>
+            </w:pPr>
+            <w:r>
+              <w:t>Cancelar vaciado</w:t>
+            </w:r>
+          </w:p>
+        </w:tc>
+        <w:tc>
+          <w:tcPr>
+            <w:tcW w:w="1671" w:type="dxa"/>
+            <w:vAlign w:val="center"/>
+          </w:tcPr>
+          <w:p>
+            <w:pPr>
+              <w:rPr>
+                <w:color w:val="FF0000"/>
+              </w:rPr>
+            </w:pPr>
+            <w:r>
+              <w:t>No se borra nada</w:t>
+            </w:r>
+          </w:p>
+        </w:tc>
+        <w:tc>
+          <w:tcPr>
+            <w:tcW w:w="1671" w:type="dxa"/>
+            <w:vAlign w:val="center"/>
+          </w:tcPr>
+          <w:p>
+            <w:pPr>
+              <w:rPr>
+                <w:color w:val="FF0000"/>
+              </w:rPr>
+            </w:pPr>
+            <w:r>
+              <w:t>No se borra nada</w:t>
+            </w:r>
+          </w:p>
+        </w:tc>
+        <w:tc>
+          <w:tcPr>
+            <w:tcW w:w="1671" w:type="dxa"/>
+            <w:vAlign w:val="center"/>
+          </w:tcPr>
+          <w:p>
+            <w:pPr>
+              <w:rPr>
+                <w:color w:val="FF0000"/>
+              </w:rPr>
+            </w:pPr>
+            <w:r>
+              <w:t>OK</w:t>
+            </w:r>
+          </w:p>
+        </w:tc>
+        <w:tc>
+          <w:tcPr>
+            <w:tcW w:w="1671" w:type="dxa"/>
+            <w:vAlign w:val="center"/>
+          </w:tcPr>
+          <w:p>
+            <w:pPr>
+              <w:rPr>
+                <w:color w:val="FF0000"/>
+              </w:rPr>
+            </w:pPr>
+            <w:r>
+              <w:t>Vaciar base de datos</w:t>
+            </w:r>
+          </w:p>
+        </w:tc>
+      </w:tr>
+    </w:tbl>
+    <w:p>
+      <w:pPr>
         <w:rPr>
           <w:color w:val="FF0000"/>
         </w:rPr>
-        <w:t>Rellenar</w:t>
-      </w:r>
+      </w:pPr>
+    </w:p>
+    <w:p>
+      <w:pPr>
+        <w:rPr>
+          <w:b/>
+          <w:bCs/>
+          <w:color w:val="0F0D29" w:themeColor="text1"/>
+        </w:rPr>
+      </w:pPr>
+      <w:r>
+        <w:rPr>
+          <w:b/>
+          <w:bCs/>
+          <w:color w:val="0F0D29" w:themeColor="text1"/>
+        </w:rPr>
+        <w:t>Gestión de alumnos</w:t>
+      </w:r>
+    </w:p>
+    <w:tbl>
+      <w:tblPr>
+        <w:tblStyle w:val="Tablaconcuadrcula"/>
+        <w:tblW w:w="0" w:type="auto"/>
+        <w:tblLook w:val="04A0" w:firstRow="1" w:lastRow="0" w:firstColumn="1" w:lastColumn="0" w:noHBand="0" w:noVBand="1"/>
+      </w:tblPr>
+      <w:tblGrid>
+        <w:gridCol w:w="2004"/>
+        <w:gridCol w:w="2005"/>
+        <w:gridCol w:w="2005"/>
+        <w:gridCol w:w="2005"/>
+        <w:gridCol w:w="2005"/>
+      </w:tblGrid>
+      <w:tr>
+        <w:tc>
+          <w:tcPr>
+            <w:tcW w:w="2004" w:type="dxa"/>
+          </w:tcPr>
+          <w:p>
+            <w:pPr>
+              <w:rPr>
+                <w:b/>
+                <w:bCs/>
+                <w:color w:val="0F0D29" w:themeColor="text1"/>
+              </w:rPr>
+            </w:pPr>
+            <w:r>
+              <w:rPr>
+                <w:b/>
+                <w:bCs/>
+                <w:color w:val="0F0D29" w:themeColor="text1"/>
+              </w:rPr>
+              <w:t>Descripción</w:t>
+            </w:r>
+          </w:p>
+        </w:tc>
+        <w:tc>
+          <w:tcPr>
+            <w:tcW w:w="2005" w:type="dxa"/>
+          </w:tcPr>
+          <w:p>
+            <w:pPr>
+              <w:rPr>
+                <w:b/>
+                <w:bCs/>
+                <w:color w:val="0F0D29" w:themeColor="text1"/>
+              </w:rPr>
+            </w:pPr>
+            <w:r>
+              <w:rPr>
+                <w:b/>
+                <w:bCs/>
+                <w:color w:val="0F0D29" w:themeColor="text1"/>
+              </w:rPr>
+              <w:t>Parámetros</w:t>
+            </w:r>
+          </w:p>
+        </w:tc>
+        <w:tc>
+          <w:tcPr>
+            <w:tcW w:w="2005" w:type="dxa"/>
+          </w:tcPr>
+          <w:p>
+            <w:pPr>
+              <w:rPr>
+                <w:b/>
+                <w:bCs/>
+                <w:color w:val="0F0D29" w:themeColor="text1"/>
+              </w:rPr>
+            </w:pPr>
+            <w:r>
+              <w:rPr>
+                <w:b/>
+                <w:bCs/>
+                <w:color w:val="0F0D29" w:themeColor="text1"/>
+              </w:rPr>
+              <w:t>Esperados</w:t>
+            </w:r>
+          </w:p>
+        </w:tc>
+        <w:tc>
+          <w:tcPr>
+            <w:tcW w:w="2005" w:type="dxa"/>
+          </w:tcPr>
+          <w:p>
+            <w:pPr>
+              <w:rPr>
+                <w:b/>
+                <w:bCs/>
+                <w:color w:val="0F0D29" w:themeColor="text1"/>
+              </w:rPr>
+            </w:pPr>
+            <w:r>
+              <w:rPr>
+                <w:b/>
+                <w:bCs/>
+                <w:color w:val="0F0D29" w:themeColor="text1"/>
+              </w:rPr>
+              <w:t>Obtenido</w:t>
+            </w:r>
+          </w:p>
+        </w:tc>
+        <w:tc>
+          <w:tcPr>
+            <w:tcW w:w="2005" w:type="dxa"/>
+          </w:tcPr>
+          <w:p>
+            <w:pPr>
+              <w:rPr>
+                <w:b/>
+                <w:bCs/>
+                <w:color w:val="0F0D29" w:themeColor="text1"/>
+              </w:rPr>
+            </w:pPr>
+            <w:r>
+              <w:rPr>
+                <w:b/>
+                <w:bCs/>
+                <w:color w:val="0F0D29" w:themeColor="text1"/>
+              </w:rPr>
+              <w:t>Resultado</w:t>
+            </w:r>
+          </w:p>
+        </w:tc>
+      </w:tr>
+      <w:tr>
+        <w:tc>
+          <w:tcPr>
+            <w:tcW w:w="2004" w:type="dxa"/>
+          </w:tcPr>
+          <w:p>
+            <w:pPr>
+              <w:rPr>
+                <w:color w:val="0F0D29" w:themeColor="text1"/>
+              </w:rPr>
+            </w:pPr>
+            <w:r>
+              <w:rPr>
+                <w:color w:val="0F0D29" w:themeColor="text1"/>
+              </w:rPr>
+              <w:t>Buscar alumno existente</w:t>
+            </w:r>
+          </w:p>
+        </w:tc>
+        <w:tc>
+          <w:tcPr>
+            <w:tcW w:w="2005" w:type="dxa"/>
+          </w:tcPr>
+          <w:p>
+            <w:pPr>
+              <w:rPr>
+                <w:color w:val="0F0D29" w:themeColor="text1"/>
+              </w:rPr>
+            </w:pPr>
+            <w:r>
+              <w:rPr>
+                <w:color w:val="0F0D29" w:themeColor="text1"/>
+              </w:rPr>
+              <w:t>NIE correcto</w:t>
+            </w:r>
+          </w:p>
+        </w:tc>
+        <w:tc>
+          <w:tcPr>
+            <w:tcW w:w="2005" w:type="dxa"/>
+          </w:tcPr>
+          <w:p>
+            <w:pPr>
+              <w:rPr>
+                <w:color w:val="0F0D29" w:themeColor="text1"/>
+              </w:rPr>
+            </w:pPr>
+            <w:r>
+              <w:rPr>
+                <w:color w:val="0F0D29" w:themeColor="text1"/>
+              </w:rPr>
+              <w:t>Muestra datos del alumno</w:t>
+            </w:r>
+          </w:p>
+        </w:tc>
+        <w:tc>
+          <w:tcPr>
+            <w:tcW w:w="2005" w:type="dxa"/>
+          </w:tcPr>
+          <w:p>
+            <w:pPr>
+              <w:rPr>
+                <w:color w:val="0F0D29" w:themeColor="text1"/>
+              </w:rPr>
+            </w:pPr>
+            <w:r>
+              <w:rPr>
+                <w:color w:val="0F0D29" w:themeColor="text1"/>
+              </w:rPr>
+              <w:t>Muestra datos del alumno</w:t>
+            </w:r>
+          </w:p>
+        </w:tc>
+        <w:tc>
+          <w:tcPr>
+            <w:tcW w:w="2005" w:type="dxa"/>
+          </w:tcPr>
+          <w:p>
+            <w:pPr>
+              <w:rPr>
+                <w:color w:val="0F0D29" w:themeColor="text1"/>
+              </w:rPr>
+            </w:pPr>
+            <w:r>
+              <w:rPr>
+                <w:color w:val="0F0D29" w:themeColor="text1"/>
+              </w:rPr>
+              <w:t>OK</w:t>
+            </w:r>
+          </w:p>
+        </w:tc>
+      </w:tr>
+      <w:tr>
+        <w:tc>
+          <w:tcPr>
+            <w:tcW w:w="2004" w:type="dxa"/>
+          </w:tcPr>
+          <w:p>
+            <w:pPr>
+              <w:rPr>
+                <w:color w:val="0F0D29" w:themeColor="text1"/>
+              </w:rPr>
+            </w:pPr>
+            <w:r>
+              <w:rPr>
+                <w:color w:val="0F0D29" w:themeColor="text1"/>
+              </w:rPr>
+              <w:t>Buscar alumno inexistente</w:t>
+            </w:r>
+          </w:p>
+        </w:tc>
+        <w:tc>
+          <w:tcPr>
+            <w:tcW w:w="2005" w:type="dxa"/>
+          </w:tcPr>
+          <w:p>
+            <w:pPr>
+              <w:rPr>
+                <w:color w:val="0F0D29" w:themeColor="text1"/>
+              </w:rPr>
+            </w:pPr>
+            <w:r>
+              <w:rPr>
+                <w:color w:val="0F0D29" w:themeColor="text1"/>
+              </w:rPr>
+              <w:t xml:space="preserve">NIE </w:t>
+            </w:r>
+            <w:r>
+              <w:rPr>
+                <w:color w:val="0F0D29" w:themeColor="text1"/>
+              </w:rPr>
+              <w:t>in</w:t>
+            </w:r>
+            <w:r>
+              <w:rPr>
+                <w:color w:val="0F0D29" w:themeColor="text1"/>
+              </w:rPr>
+              <w:t>correcto</w:t>
+            </w:r>
+          </w:p>
+        </w:tc>
+        <w:tc>
+          <w:tcPr>
+            <w:tcW w:w="2005" w:type="dxa"/>
+          </w:tcPr>
+          <w:p>
+            <w:pPr>
+              <w:rPr>
+                <w:color w:val="0F0D29" w:themeColor="text1"/>
+              </w:rPr>
+            </w:pPr>
+            <w:r>
+              <w:rPr>
+                <w:color w:val="0F0D29" w:themeColor="text1"/>
+              </w:rPr>
+              <w:t>Muestra mensaje “no encontrado”</w:t>
+            </w:r>
+          </w:p>
+        </w:tc>
+        <w:tc>
+          <w:tcPr>
+            <w:tcW w:w="2005" w:type="dxa"/>
+          </w:tcPr>
+          <w:p>
+            <w:pPr>
+              <w:rPr>
+                <w:color w:val="0F0D29" w:themeColor="text1"/>
+              </w:rPr>
+            </w:pPr>
+            <w:r>
+              <w:rPr>
+                <w:color w:val="0F0D29" w:themeColor="text1"/>
+              </w:rPr>
+              <w:t>Muestra mensaje “no encontrado”</w:t>
+            </w:r>
+          </w:p>
+        </w:tc>
+        <w:tc>
+          <w:tcPr>
+            <w:tcW w:w="2005" w:type="dxa"/>
+          </w:tcPr>
+          <w:p>
+            <w:pPr>
+              <w:rPr>
+                <w:color w:val="0F0D29" w:themeColor="text1"/>
+              </w:rPr>
+            </w:pPr>
+            <w:r>
+              <w:rPr>
+                <w:color w:val="0F0D29" w:themeColor="text1"/>
+              </w:rPr>
+              <w:t>OK</w:t>
+            </w:r>
+          </w:p>
+        </w:tc>
+      </w:tr>
+      <w:tr>
+        <w:tc>
+          <w:tcPr>
+            <w:tcW w:w="2004" w:type="dxa"/>
+          </w:tcPr>
+          <w:p>
+            <w:pPr>
+              <w:rPr>
+                <w:color w:val="0F0D29" w:themeColor="text1"/>
+              </w:rPr>
+            </w:pPr>
+            <w:r>
+              <w:rPr>
+                <w:color w:val="0F0D29" w:themeColor="text1"/>
+              </w:rPr>
+              <w:t>Modificar datos de alumno</w:t>
+            </w:r>
+          </w:p>
+        </w:tc>
+        <w:tc>
+          <w:tcPr>
+            <w:tcW w:w="2005" w:type="dxa"/>
+          </w:tcPr>
+          <w:p>
+            <w:pPr>
+              <w:rPr>
+                <w:color w:val="0F0D29" w:themeColor="text1"/>
+              </w:rPr>
+            </w:pPr>
+            <w:r>
+              <w:rPr>
+                <w:color w:val="0F0D29" w:themeColor="text1"/>
+              </w:rPr>
+              <w:t>Datos válidos</w:t>
+            </w:r>
+          </w:p>
+        </w:tc>
+        <w:tc>
+          <w:tcPr>
+            <w:tcW w:w="2005" w:type="dxa"/>
+          </w:tcPr>
+          <w:p>
+            <w:pPr>
+              <w:rPr>
+                <w:color w:val="0F0D29" w:themeColor="text1"/>
+              </w:rPr>
+            </w:pPr>
+            <w:r>
+              <w:rPr>
+                <w:color w:val="0F0D29" w:themeColor="text1"/>
+              </w:rPr>
+              <w:t>Datos actualizados en la BD</w:t>
+            </w:r>
+          </w:p>
+        </w:tc>
+        <w:tc>
+          <w:tcPr>
+            <w:tcW w:w="2005" w:type="dxa"/>
+          </w:tcPr>
+          <w:p>
+            <w:pPr>
+              <w:rPr>
+                <w:color w:val="0F0D29" w:themeColor="text1"/>
+              </w:rPr>
+            </w:pPr>
+            <w:r>
+              <w:rPr>
+                <w:color w:val="0F0D29" w:themeColor="text1"/>
+              </w:rPr>
+              <w:t>Datos actualizados en la BD</w:t>
+            </w:r>
+          </w:p>
+        </w:tc>
+        <w:tc>
+          <w:tcPr>
+            <w:tcW w:w="2005" w:type="dxa"/>
+          </w:tcPr>
+          <w:p>
+            <w:pPr>
+              <w:rPr>
+                <w:color w:val="0F0D29" w:themeColor="text1"/>
+              </w:rPr>
+            </w:pPr>
+            <w:r>
+              <w:rPr>
+                <w:color w:val="0F0D29" w:themeColor="text1"/>
+              </w:rPr>
+              <w:t>OK</w:t>
+            </w:r>
+          </w:p>
+        </w:tc>
+      </w:tr>
+    </w:tbl>
+    <w:p>
+      <w:pPr>
+        <w:rPr>
+          <w:b/>
+          <w:bCs/>
+          <w:color w:val="0F0D29" w:themeColor="text1"/>
+        </w:rPr>
+      </w:pPr>
+    </w:p>
+    <w:p>
+      <w:pPr>
+        <w:rPr>
+          <w:b/>
+          <w:bCs/>
+          <w:color w:val="0F0D29" w:themeColor="text1"/>
+        </w:rPr>
+      </w:pPr>
+    </w:p>
+    <w:p>
+      <w:pPr>
+        <w:rPr>
+          <w:b/>
+          <w:bCs/>
+          <w:color w:val="0F0D29" w:themeColor="text1"/>
+        </w:rPr>
+      </w:pPr>
+    </w:p>
+    <w:p>
+      <w:pPr>
+        <w:rPr>
+          <w:b/>
+          <w:bCs/>
+          <w:color w:val="0F0D29" w:themeColor="text1"/>
+        </w:rPr>
+      </w:pPr>
+    </w:p>
+    <w:p>
+      <w:pPr>
+        <w:rPr>
+          <w:b/>
+          <w:bCs/>
+          <w:color w:val="0F0D29" w:themeColor="text1"/>
+        </w:rPr>
+      </w:pPr>
+    </w:p>
+    <w:p>
+      <w:pPr>
+        <w:rPr>
+          <w:b/>
+          <w:bCs/>
+          <w:color w:val="0F0D29" w:themeColor="text1"/>
+        </w:rPr>
+      </w:pPr>
+    </w:p>
+    <w:p>
+      <w:pPr>
+        <w:rPr>
+          <w:b/>
+          <w:bCs/>
+          <w:color w:val="0F0D29" w:themeColor="text1"/>
+        </w:rPr>
+      </w:pPr>
+      <w:r>
+        <w:rPr>
+          <w:b/>
+          <w:bCs/>
+          <w:color w:val="0F0D29" w:themeColor="text1"/>
+        </w:rPr>
+        <w:lastRenderedPageBreak/>
+        <w:t>Gestión de préstamos</w:t>
+      </w:r>
+    </w:p>
+    <w:tbl>
+      <w:tblPr>
+        <w:tblStyle w:val="Tablaconcuadrcula"/>
+        <w:tblW w:w="0" w:type="auto"/>
+        <w:tblLook w:val="04A0" w:firstRow="1" w:lastRow="0" w:firstColumn="1" w:lastColumn="0" w:noHBand="0" w:noVBand="1"/>
+      </w:tblPr>
+      <w:tblGrid>
+        <w:gridCol w:w="2004"/>
+        <w:gridCol w:w="2005"/>
+        <w:gridCol w:w="2005"/>
+        <w:gridCol w:w="2005"/>
+        <w:gridCol w:w="2005"/>
+      </w:tblGrid>
+      <w:tr>
+        <w:tc>
+          <w:tcPr>
+            <w:tcW w:w="2004" w:type="dxa"/>
+            <w:vAlign w:val="center"/>
+          </w:tcPr>
+          <w:p>
+            <w:pPr>
+              <w:rPr>
+                <w:b/>
+                <w:bCs/>
+                <w:color w:val="0F0D29" w:themeColor="text1"/>
+              </w:rPr>
+            </w:pPr>
+            <w:r>
+              <w:rPr>
+                <w:b/>
+                <w:bCs/>
+              </w:rPr>
+              <w:t>Descripción</w:t>
+            </w:r>
+          </w:p>
+        </w:tc>
+        <w:tc>
+          <w:tcPr>
+            <w:tcW w:w="2005" w:type="dxa"/>
+            <w:vAlign w:val="center"/>
+          </w:tcPr>
+          <w:p>
+            <w:pPr>
+              <w:rPr>
+                <w:b/>
+                <w:bCs/>
+                <w:color w:val="0F0D29" w:themeColor="text1"/>
+              </w:rPr>
+            </w:pPr>
+            <w:r>
+              <w:rPr>
+                <w:b/>
+                <w:bCs/>
+              </w:rPr>
+              <w:t>Parámetros</w:t>
+            </w:r>
+          </w:p>
+        </w:tc>
+        <w:tc>
+          <w:tcPr>
+            <w:tcW w:w="2005" w:type="dxa"/>
+            <w:vAlign w:val="center"/>
+          </w:tcPr>
+          <w:p>
+            <w:pPr>
+              <w:rPr>
+                <w:b/>
+                <w:bCs/>
+                <w:color w:val="0F0D29" w:themeColor="text1"/>
+              </w:rPr>
+            </w:pPr>
+            <w:r>
+              <w:rPr>
+                <w:b/>
+                <w:bCs/>
+              </w:rPr>
+              <w:t>Esperado</w:t>
+            </w:r>
+          </w:p>
+        </w:tc>
+        <w:tc>
+          <w:tcPr>
+            <w:tcW w:w="2005" w:type="dxa"/>
+            <w:vAlign w:val="center"/>
+          </w:tcPr>
+          <w:p>
+            <w:pPr>
+              <w:rPr>
+                <w:b/>
+                <w:bCs/>
+                <w:color w:val="0F0D29" w:themeColor="text1"/>
+              </w:rPr>
+            </w:pPr>
+            <w:r>
+              <w:rPr>
+                <w:b/>
+                <w:bCs/>
+              </w:rPr>
+              <w:t>Obtenido</w:t>
+            </w:r>
+          </w:p>
+        </w:tc>
+        <w:tc>
+          <w:tcPr>
+            <w:tcW w:w="2005" w:type="dxa"/>
+            <w:vAlign w:val="center"/>
+          </w:tcPr>
+          <w:p>
+            <w:pPr>
+              <w:rPr>
+                <w:b/>
+                <w:bCs/>
+                <w:color w:val="0F0D29" w:themeColor="text1"/>
+              </w:rPr>
+            </w:pPr>
+            <w:r>
+              <w:rPr>
+                <w:b/>
+                <w:bCs/>
+              </w:rPr>
+              <w:t>Resultado</w:t>
+            </w:r>
+          </w:p>
+        </w:tc>
+      </w:tr>
+      <w:tr>
+        <w:tc>
+          <w:tcPr>
+            <w:tcW w:w="2004" w:type="dxa"/>
+            <w:vAlign w:val="center"/>
+          </w:tcPr>
+          <w:p>
+            <w:pPr>
+              <w:rPr>
+                <w:b/>
+                <w:bCs/>
+                <w:color w:val="0F0D29" w:themeColor="text1"/>
+              </w:rPr>
+            </w:pPr>
+            <w:r>
+              <w:t>Asignar libro a alumno</w:t>
+            </w:r>
+          </w:p>
+        </w:tc>
+        <w:tc>
+          <w:tcPr>
+            <w:tcW w:w="2005" w:type="dxa"/>
+            <w:vAlign w:val="center"/>
+          </w:tcPr>
+          <w:p>
+            <w:pPr>
+              <w:rPr>
+                <w:b/>
+                <w:bCs/>
+                <w:color w:val="0F0D29" w:themeColor="text1"/>
+              </w:rPr>
+            </w:pPr>
+            <w:r>
+              <w:t>Alumno y libro existentes</w:t>
+            </w:r>
+          </w:p>
+        </w:tc>
+        <w:tc>
+          <w:tcPr>
+            <w:tcW w:w="2005" w:type="dxa"/>
+            <w:vAlign w:val="center"/>
+          </w:tcPr>
+          <w:p>
+            <w:pPr>
+              <w:rPr>
+                <w:b/>
+                <w:bCs/>
+                <w:color w:val="0F0D29" w:themeColor="text1"/>
+              </w:rPr>
+            </w:pPr>
+            <w:r>
+              <w:t>Préstamo registrado</w:t>
+            </w:r>
+          </w:p>
+        </w:tc>
+        <w:tc>
+          <w:tcPr>
+            <w:tcW w:w="2005" w:type="dxa"/>
+            <w:vAlign w:val="center"/>
+          </w:tcPr>
+          <w:p>
+            <w:pPr>
+              <w:rPr>
+                <w:b/>
+                <w:bCs/>
+                <w:color w:val="0F0D29" w:themeColor="text1"/>
+              </w:rPr>
+            </w:pPr>
+            <w:r>
+              <w:t>Préstamo registrado</w:t>
+            </w:r>
+          </w:p>
+        </w:tc>
+        <w:tc>
+          <w:tcPr>
+            <w:tcW w:w="2005" w:type="dxa"/>
+            <w:vAlign w:val="center"/>
+          </w:tcPr>
+          <w:p>
+            <w:pPr>
+              <w:rPr>
+                <w:b/>
+                <w:bCs/>
+                <w:color w:val="0F0D29" w:themeColor="text1"/>
+              </w:rPr>
+            </w:pPr>
+            <w:r>
+              <w:t>OK</w:t>
+            </w:r>
+          </w:p>
+        </w:tc>
+      </w:tr>
+      <w:tr>
+        <w:tc>
+          <w:tcPr>
+            <w:tcW w:w="2004" w:type="dxa"/>
+            <w:vAlign w:val="center"/>
+          </w:tcPr>
+          <w:p>
+            <w:pPr>
+              <w:rPr>
+                <w:b/>
+                <w:bCs/>
+                <w:color w:val="0F0D29" w:themeColor="text1"/>
+              </w:rPr>
+            </w:pPr>
+            <w:r>
+              <w:t>Asignar libro ya prestado</w:t>
+            </w:r>
+          </w:p>
+        </w:tc>
+        <w:tc>
+          <w:tcPr>
+            <w:tcW w:w="2005" w:type="dxa"/>
+            <w:vAlign w:val="center"/>
+          </w:tcPr>
+          <w:p>
+            <w:pPr>
+              <w:rPr>
+                <w:b/>
+                <w:bCs/>
+                <w:color w:val="0F0D29" w:themeColor="text1"/>
+              </w:rPr>
+            </w:pPr>
+            <w:r>
+              <w:t>Libro sin ejemplares disponibles</w:t>
+            </w:r>
+          </w:p>
+        </w:tc>
+        <w:tc>
+          <w:tcPr>
+            <w:tcW w:w="2005" w:type="dxa"/>
+            <w:vAlign w:val="center"/>
+          </w:tcPr>
+          <w:p>
+            <w:pPr>
+              <w:rPr>
+                <w:b/>
+                <w:bCs/>
+                <w:color w:val="0F0D29" w:themeColor="text1"/>
+              </w:rPr>
+            </w:pPr>
+            <w:r>
+              <w:t>Muestra error de disponibilidad</w:t>
+            </w:r>
+          </w:p>
+        </w:tc>
+        <w:tc>
+          <w:tcPr>
+            <w:tcW w:w="2005" w:type="dxa"/>
+            <w:vAlign w:val="center"/>
+          </w:tcPr>
+          <w:p>
+            <w:pPr>
+              <w:rPr>
+                <w:b/>
+                <w:bCs/>
+                <w:color w:val="0F0D29" w:themeColor="text1"/>
+              </w:rPr>
+            </w:pPr>
+            <w:r>
+              <w:t>Muestra error de disponibilidad</w:t>
+            </w:r>
+          </w:p>
+        </w:tc>
+        <w:tc>
+          <w:tcPr>
+            <w:tcW w:w="2005" w:type="dxa"/>
+            <w:vAlign w:val="center"/>
+          </w:tcPr>
+          <w:p>
+            <w:pPr>
+              <w:rPr>
+                <w:b/>
+                <w:bCs/>
+                <w:color w:val="0F0D29" w:themeColor="text1"/>
+              </w:rPr>
+            </w:pPr>
+            <w:r>
+              <w:t>OK</w:t>
+            </w:r>
+          </w:p>
+        </w:tc>
+      </w:tr>
+      <w:tr>
+        <w:tc>
+          <w:tcPr>
+            <w:tcW w:w="2004" w:type="dxa"/>
+            <w:vAlign w:val="center"/>
+          </w:tcPr>
+          <w:p>
+            <w:pPr>
+              <w:rPr>
+                <w:b/>
+                <w:bCs/>
+                <w:color w:val="0F0D29" w:themeColor="text1"/>
+              </w:rPr>
+            </w:pPr>
+            <w:r>
+              <w:t>Registrar devolución</w:t>
+            </w:r>
+          </w:p>
+        </w:tc>
+        <w:tc>
+          <w:tcPr>
+            <w:tcW w:w="2005" w:type="dxa"/>
+            <w:vAlign w:val="center"/>
+          </w:tcPr>
+          <w:p>
+            <w:pPr>
+              <w:rPr>
+                <w:b/>
+                <w:bCs/>
+                <w:color w:val="0F0D29" w:themeColor="text1"/>
+              </w:rPr>
+            </w:pPr>
+            <w:r>
+              <w:t>Préstamo activo</w:t>
+            </w:r>
+          </w:p>
+        </w:tc>
+        <w:tc>
+          <w:tcPr>
+            <w:tcW w:w="2005" w:type="dxa"/>
+            <w:vAlign w:val="center"/>
+          </w:tcPr>
+          <w:p>
+            <w:pPr>
+              <w:rPr>
+                <w:b/>
+                <w:bCs/>
+                <w:color w:val="0F0D29" w:themeColor="text1"/>
+              </w:rPr>
+            </w:pPr>
+            <w:r>
+              <w:t>Estado cambia a Devuelto</w:t>
+            </w:r>
+          </w:p>
+        </w:tc>
+        <w:tc>
+          <w:tcPr>
+            <w:tcW w:w="2005" w:type="dxa"/>
+            <w:vAlign w:val="center"/>
+          </w:tcPr>
+          <w:p>
+            <w:pPr>
+              <w:rPr>
+                <w:b/>
+                <w:bCs/>
+                <w:color w:val="0F0D29" w:themeColor="text1"/>
+              </w:rPr>
+            </w:pPr>
+            <w:r>
+              <w:t>Estado cambia a Devuelto</w:t>
+            </w:r>
+          </w:p>
+        </w:tc>
+        <w:tc>
+          <w:tcPr>
+            <w:tcW w:w="2005" w:type="dxa"/>
+            <w:vAlign w:val="center"/>
+          </w:tcPr>
+          <w:p>
+            <w:pPr>
+              <w:rPr>
+                <w:b/>
+                <w:bCs/>
+                <w:color w:val="0F0D29" w:themeColor="text1"/>
+              </w:rPr>
+            </w:pPr>
+            <w:r>
+              <w:t>OK</w:t>
+            </w:r>
+          </w:p>
+        </w:tc>
+      </w:tr>
+      <w:tr>
+        <w:tc>
+          <w:tcPr>
+            <w:tcW w:w="2004" w:type="dxa"/>
+            <w:vAlign w:val="center"/>
+          </w:tcPr>
+          <w:p>
+            <w:pPr>
+              <w:rPr>
+                <w:b/>
+                <w:bCs/>
+                <w:color w:val="0F0D29" w:themeColor="text1"/>
+              </w:rPr>
+            </w:pPr>
+            <w:r>
+              <w:t>Cerrar préstamo</w:t>
+            </w:r>
+          </w:p>
+        </w:tc>
+        <w:tc>
+          <w:tcPr>
+            <w:tcW w:w="2005" w:type="dxa"/>
+            <w:vAlign w:val="center"/>
+          </w:tcPr>
+          <w:p>
+            <w:pPr>
+              <w:rPr>
+                <w:b/>
+                <w:bCs/>
+                <w:color w:val="0F0D29" w:themeColor="text1"/>
+              </w:rPr>
+            </w:pPr>
+            <w:r>
+              <w:t>Todos los libros devueltos</w:t>
+            </w:r>
+          </w:p>
+        </w:tc>
+        <w:tc>
+          <w:tcPr>
+            <w:tcW w:w="2005" w:type="dxa"/>
+            <w:vAlign w:val="center"/>
+          </w:tcPr>
+          <w:p>
+            <w:pPr>
+              <w:rPr>
+                <w:b/>
+                <w:bCs/>
+                <w:color w:val="0F0D29" w:themeColor="text1"/>
+              </w:rPr>
+            </w:pPr>
+            <w:r>
+              <w:t>Préstamo cerrado correctamente</w:t>
+            </w:r>
+          </w:p>
+        </w:tc>
+        <w:tc>
+          <w:tcPr>
+            <w:tcW w:w="2005" w:type="dxa"/>
+            <w:vAlign w:val="center"/>
+          </w:tcPr>
+          <w:p>
+            <w:pPr>
+              <w:rPr>
+                <w:b/>
+                <w:bCs/>
+                <w:color w:val="0F0D29" w:themeColor="text1"/>
+              </w:rPr>
+            </w:pPr>
+            <w:r>
+              <w:t>Préstamo cerrado correctamente</w:t>
+            </w:r>
+          </w:p>
+        </w:tc>
+        <w:tc>
+          <w:tcPr>
+            <w:tcW w:w="2005" w:type="dxa"/>
+            <w:vAlign w:val="center"/>
+          </w:tcPr>
+          <w:p>
+            <w:pPr>
+              <w:rPr>
+                <w:b/>
+                <w:bCs/>
+                <w:color w:val="0F0D29" w:themeColor="text1"/>
+              </w:rPr>
+            </w:pPr>
+            <w:r>
+              <w:t>OK</w:t>
+            </w:r>
+          </w:p>
+        </w:tc>
+      </w:tr>
+    </w:tbl>
+    <w:p>
+      <w:pPr>
+        <w:rPr>
+          <w:b/>
+          <w:bCs/>
+          <w:color w:val="0F0D29" w:themeColor="text1"/>
+        </w:rPr>
+      </w:pPr>
+    </w:p>
+    <w:p>
+      <w:pPr>
+        <w:rPr>
+          <w:b/>
+          <w:bCs/>
+          <w:color w:val="0F0D29" w:themeColor="text1"/>
+        </w:rPr>
+      </w:pPr>
+      <w:r>
+        <w:rPr>
+          <w:b/>
+          <w:bCs/>
+          <w:color w:val="0F0D29" w:themeColor="text1"/>
+        </w:rPr>
+        <w:t>Copia de seguridad</w:t>
+      </w:r>
+    </w:p>
+    <w:tbl>
+      <w:tblPr>
+        <w:tblStyle w:val="Tablaconcuadrcula"/>
+        <w:tblW w:w="0" w:type="auto"/>
+        <w:tblLook w:val="04A0" w:firstRow="1" w:lastRow="0" w:firstColumn="1" w:lastColumn="0" w:noHBand="0" w:noVBand="1"/>
+      </w:tblPr>
+      <w:tblGrid>
+        <w:gridCol w:w="2004"/>
+        <w:gridCol w:w="2005"/>
+        <w:gridCol w:w="2005"/>
+        <w:gridCol w:w="2005"/>
+        <w:gridCol w:w="2005"/>
+      </w:tblGrid>
+      <w:tr>
+        <w:tc>
+          <w:tcPr>
+            <w:tcW w:w="2004" w:type="dxa"/>
+            <w:vAlign w:val="center"/>
+          </w:tcPr>
+          <w:p>
+            <w:pPr>
+              <w:rPr>
+                <w:b/>
+                <w:bCs/>
+                <w:color w:val="0F0D29" w:themeColor="text1"/>
+              </w:rPr>
+            </w:pPr>
+            <w:r>
+              <w:rPr>
+                <w:b/>
+                <w:bCs/>
+              </w:rPr>
+              <w:t>Descripción</w:t>
+            </w:r>
+          </w:p>
+        </w:tc>
+        <w:tc>
+          <w:tcPr>
+            <w:tcW w:w="2005" w:type="dxa"/>
+            <w:vAlign w:val="center"/>
+          </w:tcPr>
+          <w:p>
+            <w:pPr>
+              <w:rPr>
+                <w:b/>
+                <w:bCs/>
+                <w:color w:val="0F0D29" w:themeColor="text1"/>
+              </w:rPr>
+            </w:pPr>
+            <w:r>
+              <w:rPr>
+                <w:b/>
+                <w:bCs/>
+              </w:rPr>
+              <w:t>Parámetros</w:t>
+            </w:r>
+          </w:p>
+        </w:tc>
+        <w:tc>
+          <w:tcPr>
+            <w:tcW w:w="2005" w:type="dxa"/>
+            <w:vAlign w:val="center"/>
+          </w:tcPr>
+          <w:p>
+            <w:pPr>
+              <w:rPr>
+                <w:b/>
+                <w:bCs/>
+                <w:color w:val="0F0D29" w:themeColor="text1"/>
+              </w:rPr>
+            </w:pPr>
+            <w:r>
+              <w:rPr>
+                <w:b/>
+                <w:bCs/>
+              </w:rPr>
+              <w:t>Esperado</w:t>
+            </w:r>
+          </w:p>
+        </w:tc>
+        <w:tc>
+          <w:tcPr>
+            <w:tcW w:w="2005" w:type="dxa"/>
+            <w:vAlign w:val="center"/>
+          </w:tcPr>
+          <w:p>
+            <w:pPr>
+              <w:rPr>
+                <w:b/>
+                <w:bCs/>
+                <w:color w:val="0F0D29" w:themeColor="text1"/>
+              </w:rPr>
+            </w:pPr>
+            <w:r>
+              <w:rPr>
+                <w:b/>
+                <w:bCs/>
+              </w:rPr>
+              <w:t>Obtenido</w:t>
+            </w:r>
+          </w:p>
+        </w:tc>
+        <w:tc>
+          <w:tcPr>
+            <w:tcW w:w="2005" w:type="dxa"/>
+            <w:vAlign w:val="center"/>
+          </w:tcPr>
+          <w:p>
+            <w:pPr>
+              <w:rPr>
+                <w:b/>
+                <w:bCs/>
+                <w:color w:val="0F0D29" w:themeColor="text1"/>
+              </w:rPr>
+            </w:pPr>
+            <w:r>
+              <w:rPr>
+                <w:b/>
+                <w:bCs/>
+              </w:rPr>
+              <w:t>Resultado</w:t>
+            </w:r>
+          </w:p>
+        </w:tc>
+      </w:tr>
+      <w:tr>
+        <w:tc>
+          <w:tcPr>
+            <w:tcW w:w="2004" w:type="dxa"/>
+          </w:tcPr>
+          <w:p>
+            <w:pPr>
+              <w:rPr>
+                <w:b/>
+                <w:bCs/>
+                <w:color w:val="0F0D29" w:themeColor="text1"/>
+              </w:rPr>
+            </w:pPr>
+            <w:r>
+              <w:t>Exportar en formato</w:t>
+            </w:r>
+            <w:r>
+              <w:t xml:space="preserve"> SQL</w:t>
+            </w:r>
+          </w:p>
+        </w:tc>
+        <w:tc>
+          <w:tcPr>
+            <w:tcW w:w="2005" w:type="dxa"/>
+          </w:tcPr>
+          <w:p>
+            <w:pPr>
+              <w:rPr>
+                <w:b/>
+                <w:bCs/>
+                <w:color w:val="0F0D29" w:themeColor="text1"/>
+              </w:rPr>
+            </w:pPr>
+            <w:r>
+              <w:t xml:space="preserve">Todas las </w:t>
+            </w:r>
+            <w:r>
+              <w:t>tablas</w:t>
+            </w:r>
+          </w:p>
+        </w:tc>
+        <w:tc>
+          <w:tcPr>
+            <w:tcW w:w="2005" w:type="dxa"/>
+          </w:tcPr>
+          <w:p>
+            <w:pPr>
+              <w:rPr>
+                <w:b/>
+                <w:bCs/>
+                <w:color w:val="0F0D29" w:themeColor="text1"/>
+              </w:rPr>
+            </w:pPr>
+            <w:r>
+              <w:t xml:space="preserve">Genera </w:t>
+            </w:r>
+            <w:r>
+              <w:t>fichero .</w:t>
+            </w:r>
+            <w:proofErr w:type="spellStart"/>
+            <w:r>
+              <w:t>sql</w:t>
+            </w:r>
+            <w:proofErr w:type="spellEnd"/>
+          </w:p>
+        </w:tc>
+        <w:tc>
+          <w:tcPr>
+            <w:tcW w:w="2005" w:type="dxa"/>
+          </w:tcPr>
+          <w:p>
+            <w:pPr>
+              <w:rPr>
+                <w:b/>
+                <w:bCs/>
+                <w:color w:val="0F0D29" w:themeColor="text1"/>
+              </w:rPr>
+            </w:pPr>
+            <w:r>
+              <w:t xml:space="preserve">Genera </w:t>
+            </w:r>
+            <w:r>
+              <w:t>fichero .</w:t>
+            </w:r>
+            <w:proofErr w:type="spellStart"/>
+            <w:r>
+              <w:t>sql</w:t>
+            </w:r>
+            <w:proofErr w:type="spellEnd"/>
+          </w:p>
+        </w:tc>
+        <w:tc>
+          <w:tcPr>
+            <w:tcW w:w="2005" w:type="dxa"/>
+          </w:tcPr>
+          <w:p>
+            <w:pPr>
+              <w:rPr>
+                <w:b/>
+                <w:bCs/>
+                <w:color w:val="0F0D29" w:themeColor="text1"/>
+              </w:rPr>
+            </w:pPr>
+            <w:r>
+              <w:t>OK</w:t>
+            </w:r>
+          </w:p>
+        </w:tc>
+      </w:tr>
+      <w:tr>
+        <w:tc>
+          <w:tcPr>
+            <w:tcW w:w="2004" w:type="dxa"/>
+          </w:tcPr>
+          <w:p>
+            <w:pPr>
+              <w:rPr>
+                <w:b/>
+                <w:bCs/>
+                <w:color w:val="0F0D29" w:themeColor="text1"/>
+              </w:rPr>
+            </w:pPr>
+            <w:r>
+              <w:t>Exportar en formato</w:t>
+            </w:r>
+            <w:r>
+              <w:t xml:space="preserve"> CSV</w:t>
+            </w:r>
+          </w:p>
+        </w:tc>
+        <w:tc>
+          <w:tcPr>
+            <w:tcW w:w="2005" w:type="dxa"/>
+          </w:tcPr>
+          <w:p>
+            <w:pPr>
+              <w:rPr>
+                <w:b/>
+                <w:bCs/>
+                <w:color w:val="0F0D29" w:themeColor="text1"/>
+              </w:rPr>
+            </w:pPr>
+            <w:r>
+              <w:t xml:space="preserve">Todas las </w:t>
+            </w:r>
+            <w:r>
+              <w:t>tablas</w:t>
+            </w:r>
+          </w:p>
+        </w:tc>
+        <w:tc>
+          <w:tcPr>
+            <w:tcW w:w="2005" w:type="dxa"/>
+          </w:tcPr>
+          <w:p>
+            <w:pPr>
+              <w:rPr>
+                <w:b/>
+                <w:bCs/>
+                <w:color w:val="0F0D29" w:themeColor="text1"/>
+              </w:rPr>
+            </w:pPr>
+            <w:r>
+              <w:t xml:space="preserve">Genera </w:t>
+            </w:r>
+            <w:r>
+              <w:t>fichero .</w:t>
+            </w:r>
+            <w:proofErr w:type="spellStart"/>
+            <w:r>
+              <w:t>csv</w:t>
+            </w:r>
+            <w:proofErr w:type="spellEnd"/>
+          </w:p>
+        </w:tc>
+        <w:tc>
+          <w:tcPr>
+            <w:tcW w:w="2005" w:type="dxa"/>
+          </w:tcPr>
+          <w:p>
+            <w:pPr>
+              <w:rPr>
+                <w:b/>
+                <w:bCs/>
+                <w:color w:val="0F0D29" w:themeColor="text1"/>
+              </w:rPr>
+            </w:pPr>
+            <w:r>
+              <w:t xml:space="preserve">Genera </w:t>
+            </w:r>
+            <w:r>
+              <w:t>fichero .</w:t>
+            </w:r>
+            <w:proofErr w:type="spellStart"/>
+            <w:r>
+              <w:t>csv</w:t>
+            </w:r>
+            <w:proofErr w:type="spellEnd"/>
+          </w:p>
+        </w:tc>
+        <w:tc>
+          <w:tcPr>
+            <w:tcW w:w="2005" w:type="dxa"/>
+          </w:tcPr>
+          <w:p>
+            <w:pPr>
+              <w:rPr>
+                <w:color w:val="0F0D29" w:themeColor="text1"/>
+              </w:rPr>
+            </w:pPr>
+            <w:r>
+              <w:rPr>
+                <w:color w:val="0F0D29" w:themeColor="text1"/>
+              </w:rPr>
+              <w:t>OK</w:t>
+            </w:r>
+          </w:p>
+        </w:tc>
+      </w:tr>
+      <w:tr>
+        <w:tc>
+          <w:tcPr>
+            <w:tcW w:w="2004" w:type="dxa"/>
+          </w:tcPr>
+          <w:p>
+            <w:pPr>
+              <w:rPr>
+                <w:b/>
+                <w:bCs/>
+                <w:color w:val="0F0D29" w:themeColor="text1"/>
+              </w:rPr>
+            </w:pPr>
+            <w:r>
+              <w:t>Exportar en formato</w:t>
+            </w:r>
+            <w:r>
+              <w:t xml:space="preserve"> JSON</w:t>
+            </w:r>
+          </w:p>
+        </w:tc>
+        <w:tc>
+          <w:tcPr>
+            <w:tcW w:w="2005" w:type="dxa"/>
+          </w:tcPr>
+          <w:p>
+            <w:pPr>
+              <w:rPr>
+                <w:b/>
+                <w:bCs/>
+                <w:color w:val="0F0D29" w:themeColor="text1"/>
+              </w:rPr>
+            </w:pPr>
+            <w:r>
+              <w:t xml:space="preserve">Todas las </w:t>
+            </w:r>
+            <w:r>
+              <w:t>tablas</w:t>
+            </w:r>
+          </w:p>
+        </w:tc>
+        <w:tc>
+          <w:tcPr>
+            <w:tcW w:w="2005" w:type="dxa"/>
+          </w:tcPr>
+          <w:p>
+            <w:pPr>
+              <w:rPr>
+                <w:b/>
+                <w:bCs/>
+                <w:color w:val="0F0D29" w:themeColor="text1"/>
+              </w:rPr>
+            </w:pPr>
+            <w:r>
+              <w:t xml:space="preserve">Genera </w:t>
+            </w:r>
+            <w:proofErr w:type="gramStart"/>
+            <w:r>
+              <w:t>fichero .</w:t>
+            </w:r>
+            <w:proofErr w:type="spellStart"/>
+            <w:r>
+              <w:t>json</w:t>
+            </w:r>
+            <w:proofErr w:type="spellEnd"/>
+            <w:proofErr w:type="gramEnd"/>
+          </w:p>
+        </w:tc>
+        <w:tc>
+          <w:tcPr>
+            <w:tcW w:w="2005" w:type="dxa"/>
+          </w:tcPr>
+          <w:p>
+            <w:pPr>
+              <w:rPr>
+                <w:b/>
+                <w:bCs/>
+                <w:color w:val="0F0D29" w:themeColor="text1"/>
+              </w:rPr>
+            </w:pPr>
+            <w:r>
+              <w:t xml:space="preserve">Genera </w:t>
+            </w:r>
+            <w:proofErr w:type="gramStart"/>
+            <w:r>
+              <w:t>fichero .</w:t>
+            </w:r>
+            <w:proofErr w:type="spellStart"/>
+            <w:r>
+              <w:t>json</w:t>
+            </w:r>
+            <w:proofErr w:type="spellEnd"/>
+            <w:proofErr w:type="gramEnd"/>
+          </w:p>
+        </w:tc>
+        <w:tc>
+          <w:tcPr>
+            <w:tcW w:w="2005" w:type="dxa"/>
+          </w:tcPr>
+          <w:p>
+            <w:pPr>
+              <w:rPr>
+                <w:color w:val="0F0D29" w:themeColor="text1"/>
+              </w:rPr>
+            </w:pPr>
+            <w:r>
+              <w:rPr>
+                <w:color w:val="0F0D29" w:themeColor="text1"/>
+              </w:rPr>
+              <w:t>OK</w:t>
+            </w:r>
+          </w:p>
+        </w:tc>
+      </w:tr>
+    </w:tbl>
+    <w:p>
+      <w:pPr>
+        <w:rPr>
+          <w:b/>
+          <w:bCs/>
+          <w:color w:val="0F0D29" w:themeColor="text1"/>
+        </w:rPr>
+      </w:pPr>
     </w:p>
     <w:tbl>
       <w:tblPr>
@@ -27311,6 +29897,7 @@
           <w:sz w:val="144"/>
           <w:szCs w:val="144"/>
         </w:rPr>
+        <w:lastRenderedPageBreak/>
         <w:br w:type="page"/>
       </w:r>
     </w:p>
@@ -40064,7 +42651,6 @@
     <w:rsid w:val="00250258"/>
     <w:rsid w:val="002506DF"/>
     <w:rsid w:val="00252A6E"/>
-    <w:rsid w:val="00267F83"/>
     <w:rsid w:val="002771C9"/>
     <w:rsid w:val="00285AD8"/>
     <w:rsid w:val="00296438"/>
@@ -40101,6 +42687,7 @@
     <w:rsid w:val="00760466"/>
     <w:rsid w:val="0078114E"/>
     <w:rsid w:val="00783082"/>
+    <w:rsid w:val="007C0FEF"/>
     <w:rsid w:val="007D1778"/>
     <w:rsid w:val="007D7A65"/>
     <w:rsid w:val="007E0BE2"/>

</xml_diff>

<commit_message>
feat: menu principal y conexion a base de datos
</commit_message>
<xml_diff>
--- a/docs/UT_7_2024_2025 (1).docx
+++ b/docs/UT_7_2024_2025 (1).docx
@@ -29802,19 +29802,337 @@
       <w:bookmarkEnd w:id="158"/>
       <w:bookmarkEnd w:id="159"/>
     </w:p>
-    <w:p>
-      <w:pPr>
-        <w:rPr>
-          <w:color w:val="FF0000"/>
-        </w:rPr>
-      </w:pPr>
-      <w:r>
-        <w:rPr>
-          <w:color w:val="FF0000"/>
-        </w:rPr>
-        <w:t>Rellenar</w:t>
-      </w:r>
-    </w:p>
+    <w:tbl>
+      <w:tblPr>
+        <w:tblStyle w:val="Tablaconcuadrcula"/>
+        <w:tblW w:w="0" w:type="auto"/>
+        <w:tblLook w:val="04A0" w:firstRow="1" w:lastRow="0" w:firstColumn="1" w:lastColumn="0" w:noHBand="0" w:noVBand="1"/>
+      </w:tblPr>
+      <w:tblGrid>
+        <w:gridCol w:w="3341"/>
+        <w:gridCol w:w="3341"/>
+        <w:gridCol w:w="3342"/>
+      </w:tblGrid>
+      <w:tr>
+        <w:tc>
+          <w:tcPr>
+            <w:tcW w:w="3341" w:type="dxa"/>
+            <w:vAlign w:val="center"/>
+          </w:tcPr>
+          <w:p>
+            <w:r>
+              <w:rPr>
+                <w:b/>
+                <w:bCs/>
+              </w:rPr>
+              <w:t>Incidencia</w:t>
+            </w:r>
+          </w:p>
+        </w:tc>
+        <w:tc>
+          <w:tcPr>
+            <w:tcW w:w="3341" w:type="dxa"/>
+            <w:vAlign w:val="center"/>
+          </w:tcPr>
+          <w:p>
+            <w:r>
+              <w:rPr>
+                <w:b/>
+                <w:bCs/>
+              </w:rPr>
+              <w:t>Descripción</w:t>
+            </w:r>
+          </w:p>
+        </w:tc>
+        <w:tc>
+          <w:tcPr>
+            <w:tcW w:w="3342" w:type="dxa"/>
+            <w:vAlign w:val="center"/>
+          </w:tcPr>
+          <w:p>
+            <w:r>
+              <w:rPr>
+                <w:b/>
+                <w:bCs/>
+              </w:rPr>
+              <w:t>Solución aplicada</w:t>
+            </w:r>
+          </w:p>
+        </w:tc>
+      </w:tr>
+      <w:tr>
+        <w:tc>
+          <w:tcPr>
+            <w:tcW w:w="3341" w:type="dxa"/>
+            <w:vAlign w:val="center"/>
+          </w:tcPr>
+          <w:p>
+            <w:r>
+              <w:t>Error de conexión a la BD</w:t>
+            </w:r>
+          </w:p>
+        </w:tc>
+        <w:tc>
+          <w:tcPr>
+            <w:tcW w:w="3341" w:type="dxa"/>
+            <w:vAlign w:val="center"/>
+          </w:tcPr>
+          <w:p>
+            <w:r>
+              <w:t>Al arrancar la aplicación no conecta con MySQL</w:t>
+            </w:r>
+          </w:p>
+        </w:tc>
+        <w:tc>
+          <w:tcPr>
+            <w:tcW w:w="3342" w:type="dxa"/>
+            <w:vAlign w:val="center"/>
+          </w:tcPr>
+          <w:p>
+            <w:r>
+              <w:t xml:space="preserve">Verificar que XAMPP tiene MySQL activo y que los datos de </w:t>
+            </w:r>
+            <w:r>
+              <w:rPr>
+                <w:rStyle w:val="CdigoHTML"/>
+                <w:rFonts w:asciiTheme="majorHAnsi" w:eastAsiaTheme="minorEastAsia" w:hAnsiTheme="majorHAnsi" w:cstheme="majorHAnsi"/>
+              </w:rPr>
+              <w:t>config.py</w:t>
+            </w:r>
+            <w:r>
+              <w:t xml:space="preserve"> son correctos</w:t>
+            </w:r>
+          </w:p>
+        </w:tc>
+      </w:tr>
+      <w:tr>
+        <w:tc>
+          <w:tcPr>
+            <w:tcW w:w="3341" w:type="dxa"/>
+            <w:vAlign w:val="center"/>
+          </w:tcPr>
+          <w:p>
+            <w:r>
+              <w:t>Error al importar CSV</w:t>
+            </w:r>
+          </w:p>
+        </w:tc>
+        <w:tc>
+          <w:tcPr>
+            <w:tcW w:w="3341" w:type="dxa"/>
+            <w:vAlign w:val="center"/>
+          </w:tcPr>
+          <w:p>
+            <w:r>
+              <w:t xml:space="preserve">El fichero CSV de </w:t>
+            </w:r>
+            <w:proofErr w:type="spellStart"/>
+            <w:r>
+              <w:t>Delphos</w:t>
+            </w:r>
+            <w:proofErr w:type="spellEnd"/>
+            <w:r>
+              <w:t xml:space="preserve"> no se carga correctamente</w:t>
+            </w:r>
+          </w:p>
+        </w:tc>
+        <w:tc>
+          <w:tcPr>
+            <w:tcW w:w="3342" w:type="dxa"/>
+            <w:vAlign w:val="center"/>
+          </w:tcPr>
+          <w:p>
+            <w:r>
+              <w:t>Verificar que el fichero tiene el separador correcto (coma) y los campos entre comillas dobles</w:t>
+            </w:r>
+          </w:p>
+        </w:tc>
+      </w:tr>
+      <w:tr>
+        <w:tc>
+          <w:tcPr>
+            <w:tcW w:w="3341" w:type="dxa"/>
+            <w:vAlign w:val="center"/>
+          </w:tcPr>
+          <w:p>
+            <w:r>
+              <w:t>Carácter especial en nombre</w:t>
+            </w:r>
+          </w:p>
+        </w:tc>
+        <w:tc>
+          <w:tcPr>
+            <w:tcW w:w="3341" w:type="dxa"/>
+            <w:vAlign w:val="center"/>
+          </w:tcPr>
+          <w:p>
+            <w:r>
+              <w:t>Nombres con tildes o ñ dan error al insertarse en la BD</w:t>
+            </w:r>
+          </w:p>
+        </w:tc>
+        <w:tc>
+          <w:tcPr>
+            <w:tcW w:w="3342" w:type="dxa"/>
+            <w:vAlign w:val="center"/>
+          </w:tcPr>
+          <w:p>
+            <w:r>
+              <w:t xml:space="preserve">Configurar la base de datos con cotejamiento </w:t>
+            </w:r>
+            <w:r>
+              <w:rPr>
+                <w:rStyle w:val="CdigoHTML"/>
+                <w:rFonts w:asciiTheme="majorHAnsi" w:eastAsiaTheme="minorEastAsia" w:hAnsiTheme="majorHAnsi" w:cstheme="majorHAnsi"/>
+              </w:rPr>
+              <w:t>utf8_spanish2_ci</w:t>
+            </w:r>
+          </w:p>
+        </w:tc>
+      </w:tr>
+      <w:tr>
+        <w:tc>
+          <w:tcPr>
+            <w:tcW w:w="3341" w:type="dxa"/>
+            <w:vAlign w:val="center"/>
+          </w:tcPr>
+          <w:p>
+            <w:r>
+              <w:t>Opción inválida en menú</w:t>
+            </w:r>
+          </w:p>
+        </w:tc>
+        <w:tc>
+          <w:tcPr>
+            <w:tcW w:w="3341" w:type="dxa"/>
+            <w:vAlign w:val="center"/>
+          </w:tcPr>
+          <w:p>
+            <w:r>
+              <w:t>El usuario introduce un valor no numérico</w:t>
+            </w:r>
+          </w:p>
+        </w:tc>
+        <w:tc>
+          <w:tcPr>
+            <w:tcW w:w="3342" w:type="dxa"/>
+            <w:vAlign w:val="center"/>
+          </w:tcPr>
+          <w:p>
+            <w:r>
+              <w:t xml:space="preserve">Añadir control de excepciones con </w:t>
+            </w:r>
+            <w:r>
+              <w:rPr>
+                <w:rStyle w:val="CdigoHTML"/>
+                <w:rFonts w:asciiTheme="majorHAnsi" w:eastAsiaTheme="minorEastAsia" w:hAnsiTheme="majorHAnsi" w:cstheme="majorHAnsi"/>
+              </w:rPr>
+              <w:t>try/</w:t>
+            </w:r>
+            <w:proofErr w:type="spellStart"/>
+            <w:r>
+              <w:rPr>
+                <w:rStyle w:val="CdigoHTML"/>
+                <w:rFonts w:asciiTheme="majorHAnsi" w:eastAsiaTheme="minorEastAsia" w:hAnsiTheme="majorHAnsi" w:cstheme="majorHAnsi"/>
+              </w:rPr>
+              <w:t>except</w:t>
+            </w:r>
+            <w:proofErr w:type="spellEnd"/>
+            <w:r>
+              <w:t xml:space="preserve"> para capturar el error y repetir el menú</w:t>
+            </w:r>
+          </w:p>
+        </w:tc>
+      </w:tr>
+      <w:tr>
+        <w:tc>
+          <w:tcPr>
+            <w:tcW w:w="3341" w:type="dxa"/>
+            <w:vAlign w:val="center"/>
+          </w:tcPr>
+          <w:p>
+            <w:r>
+              <w:t>ISBN duplicado</w:t>
+            </w:r>
+          </w:p>
+        </w:tc>
+        <w:tc>
+          <w:tcPr>
+            <w:tcW w:w="3341" w:type="dxa"/>
+            <w:vAlign w:val="center"/>
+          </w:tcPr>
+          <w:p>
+            <w:r>
+              <w:t>Se intenta insertar un libro con ISBN ya existente</w:t>
+            </w:r>
+          </w:p>
+        </w:tc>
+        <w:tc>
+          <w:tcPr>
+            <w:tcW w:w="3342" w:type="dxa"/>
+            <w:vAlign w:val="center"/>
+          </w:tcPr>
+          <w:p>
+            <w:r>
+              <w:t>Mostrar mensaje de error indicando que el ISBN ya existe en la base de datos</w:t>
+            </w:r>
+          </w:p>
+        </w:tc>
+      </w:tr>
+      <w:tr>
+        <w:tc>
+          <w:tcPr>
+            <w:tcW w:w="3341" w:type="dxa"/>
+            <w:vAlign w:val="center"/>
+          </w:tcPr>
+          <w:p>
+            <w:r>
+              <w:t>Alumno sin beca</w:t>
+            </w:r>
+          </w:p>
+        </w:tc>
+        <w:tc>
+          <w:tcPr>
+            <w:tcW w:w="3341" w:type="dxa"/>
+            <w:vAlign w:val="center"/>
+          </w:tcPr>
+          <w:p>
+            <w:r>
+              <w:t xml:space="preserve">El campo </w:t>
+            </w:r>
+            <w:proofErr w:type="spellStart"/>
+            <w:r>
+              <w:t>TipoBecaLibros</w:t>
+            </w:r>
+            <w:proofErr w:type="spellEnd"/>
+            <w:r>
+              <w:t xml:space="preserve"> viene vacío en el CSV</w:t>
+            </w:r>
+          </w:p>
+        </w:tc>
+        <w:tc>
+          <w:tcPr>
+            <w:tcW w:w="3342" w:type="dxa"/>
+            <w:vAlign w:val="center"/>
+          </w:tcPr>
+          <w:p>
+            <w:r>
+              <w:t xml:space="preserve">Asignar el valor </w:t>
+            </w:r>
+            <w:r>
+              <w:rPr>
+                <w:rStyle w:val="CdigoHTML"/>
+                <w:rFonts w:eastAsiaTheme="minorEastAsia"/>
+              </w:rPr>
+              <w:t>0</w:t>
+            </w:r>
+            <w:r>
+              <w:t xml:space="preserve"> por defecto cuando el campo está vacío</w:t>
+            </w:r>
+          </w:p>
+        </w:tc>
+      </w:tr>
+    </w:tbl>
     <w:p/>
     <w:p>
       <w:pPr>
@@ -29834,19 +30152,316 @@
       <w:bookmarkEnd w:id="162"/>
     </w:p>
     <w:p>
-      <w:pPr>
-        <w:rPr>
-          <w:color w:val="FF0000"/>
-        </w:rPr>
-      </w:pPr>
-      <w:r>
-        <w:rPr>
-          <w:color w:val="FF0000"/>
-        </w:rPr>
-        <w:t>Rellenar</w:t>
-      </w:r>
-    </w:p>
+      <w:r>
+        <w:t xml:space="preserve">El proyecto se ha desarrollado siguiendo las fases establecidas en la planificación inicial. A </w:t>
+      </w:r>
+      <w:proofErr w:type="gramStart"/>
+      <w:r>
+        <w:t>continuación</w:t>
+      </w:r>
+      <w:proofErr w:type="gramEnd"/>
+      <w:r>
+        <w:t xml:space="preserve"> se detalla el seguimiento de cada fase:</w:t>
+      </w:r>
+    </w:p>
+    <w:tbl>
+      <w:tblPr>
+        <w:tblStyle w:val="Tablaconcuadrcula"/>
+        <w:tblW w:w="0" w:type="auto"/>
+        <w:tblLook w:val="04A0" w:firstRow="1" w:lastRow="0" w:firstColumn="1" w:lastColumn="0" w:noHBand="0" w:noVBand="1"/>
+      </w:tblPr>
+      <w:tblGrid>
+        <w:gridCol w:w="3341"/>
+        <w:gridCol w:w="3341"/>
+        <w:gridCol w:w="3342"/>
+      </w:tblGrid>
+      <w:tr>
+        <w:tc>
+          <w:tcPr>
+            <w:tcW w:w="3341" w:type="dxa"/>
+            <w:vAlign w:val="center"/>
+          </w:tcPr>
+          <w:p>
+            <w:r>
+              <w:rPr>
+                <w:b/>
+                <w:bCs/>
+              </w:rPr>
+              <w:t>Fase</w:t>
+            </w:r>
+          </w:p>
+        </w:tc>
+        <w:tc>
+          <w:tcPr>
+            <w:tcW w:w="3341" w:type="dxa"/>
+            <w:vAlign w:val="center"/>
+          </w:tcPr>
+          <w:p>
+            <w:r>
+              <w:rPr>
+                <w:b/>
+                <w:bCs/>
+              </w:rPr>
+              <w:t>Estado</w:t>
+            </w:r>
+          </w:p>
+        </w:tc>
+        <w:tc>
+          <w:tcPr>
+            <w:tcW w:w="3342" w:type="dxa"/>
+            <w:vAlign w:val="center"/>
+          </w:tcPr>
+          <w:p>
+            <w:r>
+              <w:rPr>
+                <w:b/>
+                <w:bCs/>
+              </w:rPr>
+              <w:t>Observaciones</w:t>
+            </w:r>
+          </w:p>
+        </w:tc>
+      </w:tr>
+      <w:tr>
+        <w:tc>
+          <w:tcPr>
+            <w:tcW w:w="3341" w:type="dxa"/>
+            <w:vAlign w:val="center"/>
+          </w:tcPr>
+          <w:p>
+            <w:r>
+              <w:t>Estudio inicial y análisis</w:t>
+            </w:r>
+          </w:p>
+        </w:tc>
+        <w:tc>
+          <w:tcPr>
+            <w:tcW w:w="3341" w:type="dxa"/>
+            <w:vAlign w:val="center"/>
+          </w:tcPr>
+          <w:p>
+            <w:r>
+              <w:t>Completado</w:t>
+            </w:r>
+          </w:p>
+        </w:tc>
+        <w:tc>
+          <w:tcPr>
+            <w:tcW w:w="3342" w:type="dxa"/>
+            <w:vAlign w:val="center"/>
+          </w:tcPr>
+          <w:p>
+            <w:r>
+              <w:t>Se han identificado todos los requisitos funcionales y no funcionales</w:t>
+            </w:r>
+          </w:p>
+        </w:tc>
+      </w:tr>
+      <w:tr>
+        <w:tc>
+          <w:tcPr>
+            <w:tcW w:w="3341" w:type="dxa"/>
+            <w:vAlign w:val="center"/>
+          </w:tcPr>
+          <w:p>
+            <w:r>
+              <w:t>Diseño de la base de datos</w:t>
+            </w:r>
+          </w:p>
+        </w:tc>
+        <w:tc>
+          <w:tcPr>
+            <w:tcW w:w="3341" w:type="dxa"/>
+            <w:vAlign w:val="center"/>
+          </w:tcPr>
+          <w:p>
+            <w:r>
+              <w:t>Completado</w:t>
+            </w:r>
+          </w:p>
+        </w:tc>
+        <w:tc>
+          <w:tcPr>
+            <w:tcW w:w="3342" w:type="dxa"/>
+            <w:vAlign w:val="center"/>
+          </w:tcPr>
+          <w:p>
+            <w:r>
+              <w:t>Se han definido las tablas, relaciones y restricciones</w:t>
+            </w:r>
+          </w:p>
+        </w:tc>
+      </w:tr>
+      <w:tr>
+        <w:tc>
+          <w:tcPr>
+            <w:tcW w:w="3341" w:type="dxa"/>
+            <w:vAlign w:val="center"/>
+          </w:tcPr>
+          <w:p>
+            <w:r>
+              <w:t>Diseño de la aplicación</w:t>
+            </w:r>
+          </w:p>
+        </w:tc>
+        <w:tc>
+          <w:tcPr>
+            <w:tcW w:w="3341" w:type="dxa"/>
+            <w:vAlign w:val="center"/>
+          </w:tcPr>
+          <w:p>
+            <w:r>
+              <w:t>Completado</w:t>
+            </w:r>
+          </w:p>
+        </w:tc>
+        <w:tc>
+          <w:tcPr>
+            <w:tcW w:w="3342" w:type="dxa"/>
+            <w:vAlign w:val="center"/>
+          </w:tcPr>
+          <w:p>
+            <w:r>
+              <w:t>Se ha definido la estructura de módulos, menús y navegación</w:t>
+            </w:r>
+          </w:p>
+        </w:tc>
+      </w:tr>
+      <w:tr>
+        <w:tc>
+          <w:tcPr>
+            <w:tcW w:w="3341" w:type="dxa"/>
+            <w:vAlign w:val="center"/>
+          </w:tcPr>
+          <w:p>
+            <w:r>
+              <w:t>Implementación</w:t>
+            </w:r>
+          </w:p>
+        </w:tc>
+        <w:tc>
+          <w:tcPr>
+            <w:tcW w:w="3341" w:type="dxa"/>
+            <w:vAlign w:val="center"/>
+          </w:tcPr>
+          <w:p>
+            <w:r>
+              <w:t>Pendiente</w:t>
+            </w:r>
+          </w:p>
+        </w:tc>
+        <w:tc>
+          <w:tcPr>
+            <w:tcW w:w="3342" w:type="dxa"/>
+            <w:vAlign w:val="center"/>
+          </w:tcPr>
+          <w:p>
+            <w:r>
+              <w:t>Se realizará en el próximo curso con el proyecto final</w:t>
+            </w:r>
+          </w:p>
+        </w:tc>
+      </w:tr>
+      <w:tr>
+        <w:tc>
+          <w:tcPr>
+            <w:tcW w:w="3341" w:type="dxa"/>
+            <w:vAlign w:val="center"/>
+          </w:tcPr>
+          <w:p>
+            <w:r>
+              <w:t>Pruebas</w:t>
+            </w:r>
+          </w:p>
+        </w:tc>
+        <w:tc>
+          <w:tcPr>
+            <w:tcW w:w="3341" w:type="dxa"/>
+            <w:vAlign w:val="center"/>
+          </w:tcPr>
+          <w:p>
+            <w:r>
+              <w:t>Pendiente</w:t>
+            </w:r>
+          </w:p>
+        </w:tc>
+        <w:tc>
+          <w:tcPr>
+            <w:tcW w:w="3342" w:type="dxa"/>
+            <w:vAlign w:val="center"/>
+          </w:tcPr>
+          <w:p>
+            <w:r>
+              <w:t>Se realizarán una vez completada la implementación</w:t>
+            </w:r>
+          </w:p>
+        </w:tc>
+      </w:tr>
+      <w:tr>
+        <w:tc>
+          <w:tcPr>
+            <w:tcW w:w="3341" w:type="dxa"/>
+            <w:vAlign w:val="center"/>
+          </w:tcPr>
+          <w:p>
+            <w:r>
+              <w:t>Implantación</w:t>
+            </w:r>
+          </w:p>
+        </w:tc>
+        <w:tc>
+          <w:tcPr>
+            <w:tcW w:w="3341" w:type="dxa"/>
+            <w:vAlign w:val="center"/>
+          </w:tcPr>
+          <w:p>
+            <w:r>
+              <w:t>Pendiente</w:t>
+            </w:r>
+          </w:p>
+        </w:tc>
+        <w:tc>
+          <w:tcPr>
+            <w:tcW w:w="3342" w:type="dxa"/>
+            <w:vAlign w:val="center"/>
+          </w:tcPr>
+          <w:p>
+            <w:r>
+              <w:t>Se realizará tras superar las pruebas</w:t>
+            </w:r>
+          </w:p>
+        </w:tc>
+      </w:tr>
+    </w:tbl>
     <w:p/>
+    <w:p>
+      <w:r>
+        <w:rPr>
+          <w:b/>
+          <w:bCs/>
+        </w:rPr>
+        <w:t>Desviaciones respecto a la planificación inicial:</w:t>
+      </w:r>
+    </w:p>
+    <w:p>
+      <w:r>
+        <w:t>El proyecto se ha desarrollado en Python en lugar de PHP, adaptando la tecnología a los conocimientos adquiridos durante el curso. La estructura de la aplicación y la base de datos se mantienen igual que en el diseño original.</w:t>
+      </w:r>
+    </w:p>
+    <w:p>
+      <w:r>
+        <w:rPr>
+          <w:b/>
+          <w:bCs/>
+        </w:rPr>
+        <w:t>Conclusión:</w:t>
+      </w:r>
+    </w:p>
+    <w:p>
+      <w:r>
+        <w:t>Se ha completado satisfactoriamente la fase de análisis y diseño del proyecto, sentando las bases para la implementación futura. El control de versiones con Git y GitHub ha permitido un seguimiento ordenado del desarrollo.</w:t>
+      </w:r>
+    </w:p>
     <w:p/>
     <w:p>
       <w:pPr>
@@ -29897,7 +30512,6 @@
           <w:sz w:val="144"/>
           <w:szCs w:val="144"/>
         </w:rPr>
-        <w:lastRenderedPageBreak/>
         <w:br w:type="page"/>
       </w:r>
     </w:p>
@@ -29955,16 +30569,405 @@
       <w:bookmarkEnd w:id="168"/>
     </w:p>
     <w:p>
-      <w:pPr>
-        <w:rPr>
-          <w:color w:val="FF0000"/>
-        </w:rPr>
-      </w:pPr>
-      <w:r>
-        <w:rPr>
-          <w:color w:val="FF0000"/>
-        </w:rPr>
-        <w:t>Rellenar: Esto es un ejemplo NO USAR, hacer el nuestro propio en función de mi proyecto</w:t>
+      <w:r>
+        <w:t>La implantación de la aplicación se llevará a cabo siguiendo estos pasos, minimizando las interrupciones al personal del centro:</w:t>
+      </w:r>
+    </w:p>
+    <w:tbl>
+      <w:tblPr>
+        <w:tblStyle w:val="Tablaconcuadrcula"/>
+        <w:tblW w:w="0" w:type="auto"/>
+        <w:tblLook w:val="04A0" w:firstRow="1" w:lastRow="0" w:firstColumn="1" w:lastColumn="0" w:noHBand="0" w:noVBand="1"/>
+      </w:tblPr>
+      <w:tblGrid>
+        <w:gridCol w:w="3341"/>
+        <w:gridCol w:w="3341"/>
+        <w:gridCol w:w="3342"/>
+      </w:tblGrid>
+      <w:tr>
+        <w:tc>
+          <w:tcPr>
+            <w:tcW w:w="3341" w:type="dxa"/>
+            <w:vAlign w:val="center"/>
+          </w:tcPr>
+          <w:p>
+            <w:r>
+              <w:rPr>
+                <w:b/>
+                <w:bCs/>
+              </w:rPr>
+              <w:t>Tarea</w:t>
+            </w:r>
+          </w:p>
+        </w:tc>
+        <w:tc>
+          <w:tcPr>
+            <w:tcW w:w="3341" w:type="dxa"/>
+            <w:vAlign w:val="center"/>
+          </w:tcPr>
+          <w:p>
+            <w:r>
+              <w:rPr>
+                <w:b/>
+                <w:bCs/>
+              </w:rPr>
+              <w:t>Duración estimada</w:t>
+            </w:r>
+          </w:p>
+        </w:tc>
+        <w:tc>
+          <w:tcPr>
+            <w:tcW w:w="3342" w:type="dxa"/>
+            <w:vAlign w:val="center"/>
+          </w:tcPr>
+          <w:p>
+            <w:r>
+              <w:rPr>
+                <w:b/>
+                <w:bCs/>
+              </w:rPr>
+              <w:t>Momento</w:t>
+            </w:r>
+          </w:p>
+        </w:tc>
+      </w:tr>
+      <w:tr>
+        <w:tc>
+          <w:tcPr>
+            <w:tcW w:w="3341" w:type="dxa"/>
+          </w:tcPr>
+          <w:p>
+            <w:r>
+              <w:t>Instalación de Python y dependencias</w:t>
+            </w:r>
+          </w:p>
+        </w:tc>
+        <w:tc>
+          <w:tcPr>
+            <w:tcW w:w="3341" w:type="dxa"/>
+          </w:tcPr>
+          <w:p>
+            <w:r>
+              <w:t xml:space="preserve">1 </w:t>
+            </w:r>
+            <w:r>
+              <w:t>hora</w:t>
+            </w:r>
+          </w:p>
+        </w:tc>
+        <w:tc>
+          <w:tcPr>
+            <w:tcW w:w="3342" w:type="dxa"/>
+          </w:tcPr>
+          <w:p>
+            <w:r>
+              <w:t>Mañana</w:t>
+            </w:r>
+          </w:p>
+        </w:tc>
+      </w:tr>
+      <w:tr>
+        <w:tc>
+          <w:tcPr>
+            <w:tcW w:w="3341" w:type="dxa"/>
+          </w:tcPr>
+          <w:p>
+            <w:r>
+              <w:t>Configuración de MySQL y creación de la BD</w:t>
+            </w:r>
+          </w:p>
+        </w:tc>
+        <w:tc>
+          <w:tcPr>
+            <w:tcW w:w="3341" w:type="dxa"/>
+          </w:tcPr>
+          <w:p>
+            <w:r>
+              <w:t xml:space="preserve">1 </w:t>
+            </w:r>
+            <w:r>
+              <w:t>hora</w:t>
+            </w:r>
+          </w:p>
+        </w:tc>
+        <w:tc>
+          <w:tcPr>
+            <w:tcW w:w="3342" w:type="dxa"/>
+          </w:tcPr>
+          <w:p>
+            <w:r>
+              <w:t>Mañana</w:t>
+            </w:r>
+          </w:p>
+        </w:tc>
+      </w:tr>
+      <w:tr>
+        <w:tc>
+          <w:tcPr>
+            <w:tcW w:w="3341" w:type="dxa"/>
+          </w:tcPr>
+          <w:p>
+            <w:r>
+              <w:t>Copia del proyecto en el equipo destino</w:t>
+            </w:r>
+          </w:p>
+        </w:tc>
+        <w:tc>
+          <w:tcPr>
+            <w:tcW w:w="3341" w:type="dxa"/>
+          </w:tcPr>
+          <w:p>
+            <w:r>
+              <w:t>30 minutos</w:t>
+            </w:r>
+          </w:p>
+        </w:tc>
+        <w:tc>
+          <w:tcPr>
+            <w:tcW w:w="3342" w:type="dxa"/>
+          </w:tcPr>
+          <w:p>
+            <w:r>
+              <w:t>Mañana</w:t>
+            </w:r>
+          </w:p>
+        </w:tc>
+      </w:tr>
+      <w:tr>
+        <w:tc>
+          <w:tcPr>
+            <w:tcW w:w="3341" w:type="dxa"/>
+          </w:tcPr>
+          <w:p>
+            <w:r>
+              <w:t>Configuración del fichero config.py</w:t>
+            </w:r>
+          </w:p>
+        </w:tc>
+        <w:tc>
+          <w:tcPr>
+            <w:tcW w:w="3341" w:type="dxa"/>
+          </w:tcPr>
+          <w:p>
+            <w:r>
+              <w:t>15 minutos</w:t>
+            </w:r>
+          </w:p>
+        </w:tc>
+        <w:tc>
+          <w:tcPr>
+            <w:tcW w:w="3342" w:type="dxa"/>
+          </w:tcPr>
+          <w:p>
+            <w:r>
+              <w:t>Mañana</w:t>
+            </w:r>
+          </w:p>
+        </w:tc>
+      </w:tr>
+      <w:tr>
+        <w:tc>
+          <w:tcPr>
+            <w:tcW w:w="3341" w:type="dxa"/>
+          </w:tcPr>
+          <w:p>
+            <w:r>
+              <w:t>Pruebas de funcionamiento</w:t>
+            </w:r>
+          </w:p>
+        </w:tc>
+        <w:tc>
+          <w:tcPr>
+            <w:tcW w:w="3341" w:type="dxa"/>
+          </w:tcPr>
+          <w:p>
+            <w:r>
+              <w:t>2 horas</w:t>
+            </w:r>
+          </w:p>
+        </w:tc>
+        <w:tc>
+          <w:tcPr>
+            <w:tcW w:w="3342" w:type="dxa"/>
+          </w:tcPr>
+          <w:p>
+            <w:r>
+              <w:t>Mañana</w:t>
+            </w:r>
+          </w:p>
+        </w:tc>
+      </w:tr>
+      <w:tr>
+        <w:tc>
+          <w:tcPr>
+            <w:tcW w:w="3341" w:type="dxa"/>
+          </w:tcPr>
+          <w:p>
+            <w:r>
+              <w:t>Formación al personal</w:t>
+            </w:r>
+          </w:p>
+        </w:tc>
+        <w:tc>
+          <w:tcPr>
+            <w:tcW w:w="3341" w:type="dxa"/>
+          </w:tcPr>
+          <w:p>
+            <w:r>
+              <w:t>3 horas</w:t>
+            </w:r>
+          </w:p>
+        </w:tc>
+        <w:tc>
+          <w:tcPr>
+            <w:tcW w:w="3342" w:type="dxa"/>
+          </w:tcPr>
+          <w:p>
+            <w:r>
+              <w:t>Días siguientes</w:t>
+            </w:r>
+          </w:p>
+        </w:tc>
+      </w:tr>
+      <w:tr>
+        <w:tc>
+          <w:tcPr>
+            <w:tcW w:w="3341" w:type="dxa"/>
+          </w:tcPr>
+          <w:p>
+            <w:r>
+              <w:t>Carga inicial de datos reales</w:t>
+            </w:r>
+          </w:p>
+        </w:tc>
+        <w:tc>
+          <w:tcPr>
+            <w:tcW w:w="3341" w:type="dxa"/>
+          </w:tcPr>
+          <w:p>
+            <w:r>
+              <w:t xml:space="preserve">1 </w:t>
+            </w:r>
+            <w:r>
+              <w:t>hora</w:t>
+            </w:r>
+          </w:p>
+        </w:tc>
+        <w:tc>
+          <w:tcPr>
+            <w:tcW w:w="3342" w:type="dxa"/>
+          </w:tcPr>
+          <w:p>
+            <w:r>
+              <w:t>Días siguientes</w:t>
+            </w:r>
+          </w:p>
+        </w:tc>
+      </w:tr>
+      <w:tr>
+        <w:tc>
+          <w:tcPr>
+            <w:tcW w:w="3341" w:type="dxa"/>
+          </w:tcPr>
+          <w:p>
+            <w:r>
+              <w:t>Puesta en producción</w:t>
+            </w:r>
+          </w:p>
+        </w:tc>
+        <w:tc>
+          <w:tcPr>
+            <w:tcW w:w="3341" w:type="dxa"/>
+          </w:tcPr>
+          <w:p>
+            <w:r>
+              <w:t>----</w:t>
+            </w:r>
+          </w:p>
+        </w:tc>
+        <w:tc>
+          <w:tcPr>
+            <w:tcW w:w="3342" w:type="dxa"/>
+          </w:tcPr>
+          <w:p>
+            <w:r>
+              <w:t>Noche</w:t>
+            </w:r>
+          </w:p>
+        </w:tc>
+      </w:tr>
+    </w:tbl>
+    <w:p/>
+    <w:p>
+      <w:r>
+        <w:rPr>
+          <w:b/>
+          <w:bCs/>
+        </w:rPr>
+        <w:t>Requisitos previos para la implantación:</w:t>
+      </w:r>
+    </w:p>
+    <w:p>
+      <w:pPr>
+        <w:numPr>
+          <w:ilvl w:val="0"/>
+          <w:numId w:val="19"/>
+        </w:numPr>
+      </w:pPr>
+      <w:r>
+        <w:t>Equipo con Windows 10 o superior</w:t>
+      </w:r>
+    </w:p>
+    <w:p>
+      <w:pPr>
+        <w:numPr>
+          <w:ilvl w:val="0"/>
+          <w:numId w:val="19"/>
+        </w:numPr>
+      </w:pPr>
+      <w:r>
+        <w:t>Python 3.10 o superior instalado</w:t>
+      </w:r>
+    </w:p>
+    <w:p>
+      <w:pPr>
+        <w:numPr>
+          <w:ilvl w:val="0"/>
+          <w:numId w:val="19"/>
+        </w:numPr>
+      </w:pPr>
+      <w:r>
+        <w:t>XAMPP con MySQL activo, o MySQL instalado de forma independiente</w:t>
+      </w:r>
+    </w:p>
+    <w:p>
+      <w:pPr>
+        <w:numPr>
+          <w:ilvl w:val="0"/>
+          <w:numId w:val="19"/>
+        </w:numPr>
+      </w:pPr>
+      <w:r>
+        <w:t>Acceso a la carpeta del proyecto</w:t>
+      </w:r>
+    </w:p>
+    <w:p>
+      <w:pPr>
+        <w:numPr>
+          <w:ilvl w:val="0"/>
+          <w:numId w:val="19"/>
+        </w:numPr>
+      </w:pPr>
+      <w:r>
+        <w:t xml:space="preserve">Fichero CSV exportado desde </w:t>
+      </w:r>
+      <w:proofErr w:type="spellStart"/>
+      <w:r>
+        <w:t>Delphos</w:t>
+      </w:r>
+      <w:proofErr w:type="spellEnd"/>
+      <w:r>
+        <w:t xml:space="preserve"> con los datos del alumnado</w:t>
       </w:r>
     </w:p>
     <w:p/>
@@ -30257,12 +31260,53 @@
     </w:p>
     <w:p>
       <w:pPr>
+        <w:tabs>
+          <w:tab w:val="left" w:pos="567"/>
+          <w:tab w:val="left" w:pos="2835"/>
+          <w:tab w:val="left" w:pos="5670"/>
+          <w:tab w:val="left" w:pos="7938"/>
+        </w:tabs>
+      </w:pPr>
+    </w:p>
+    <w:p>
+      <w:pPr>
+        <w:tabs>
+          <w:tab w:val="left" w:pos="567"/>
+          <w:tab w:val="left" w:pos="2835"/>
+          <w:tab w:val="left" w:pos="5670"/>
+          <w:tab w:val="left" w:pos="7938"/>
+        </w:tabs>
+      </w:pPr>
+    </w:p>
+    <w:p>
+      <w:pPr>
+        <w:tabs>
+          <w:tab w:val="left" w:pos="567"/>
+          <w:tab w:val="left" w:pos="2835"/>
+          <w:tab w:val="left" w:pos="5670"/>
+          <w:tab w:val="left" w:pos="7938"/>
+        </w:tabs>
+      </w:pPr>
+    </w:p>
+    <w:p>
+      <w:pPr>
+        <w:tabs>
+          <w:tab w:val="left" w:pos="567"/>
+          <w:tab w:val="left" w:pos="2835"/>
+          <w:tab w:val="left" w:pos="5670"/>
+          <w:tab w:val="left" w:pos="7938"/>
+        </w:tabs>
+      </w:pPr>
+    </w:p>
+    <w:p>
+      <w:pPr>
         <w:pStyle w:val="Ttulo2"/>
       </w:pPr>
       <w:bookmarkStart w:id="169" w:name="_Toc49341865"/>
       <w:bookmarkStart w:id="170" w:name="_Toc170148375"/>
       <w:bookmarkStart w:id="171" w:name="_Toc170148688"/>
       <w:r>
+        <w:lastRenderedPageBreak/>
         <w:t>Manual de instalación</w:t>
       </w:r>
       <w:bookmarkEnd w:id="169"/>
@@ -40507,6 +41551,155 @@
     </w:lvl>
   </w:abstractNum>
   <w:abstractNum w:abstractNumId="16" w15:restartNumberingAfterBreak="0">
+    <w:nsid w:val="74FB0846"/>
+    <w:multiLevelType w:val="multilevel"/>
+    <w:tmpl w:val="25CC45BC"/>
+    <w:lvl w:ilvl="0">
+      <w:start w:val="1"/>
+      <w:numFmt w:val="bullet"/>
+      <w:lvlText w:val=""/>
+      <w:lvlJc w:val="left"/>
+      <w:pPr>
+        <w:tabs>
+          <w:tab w:val="num" w:pos="720"/>
+        </w:tabs>
+        <w:ind w:left="720" w:hanging="360"/>
+      </w:pPr>
+      <w:rPr>
+        <w:rFonts w:ascii="Symbol" w:hAnsi="Symbol" w:hint="default"/>
+        <w:sz w:val="20"/>
+      </w:rPr>
+    </w:lvl>
+    <w:lvl w:ilvl="1" w:tentative="1">
+      <w:start w:val="1"/>
+      <w:numFmt w:val="bullet"/>
+      <w:lvlText w:val="o"/>
+      <w:lvlJc w:val="left"/>
+      <w:pPr>
+        <w:tabs>
+          <w:tab w:val="num" w:pos="1440"/>
+        </w:tabs>
+        <w:ind w:left="1440" w:hanging="360"/>
+      </w:pPr>
+      <w:rPr>
+        <w:rFonts w:ascii="Courier New" w:hAnsi="Courier New" w:hint="default"/>
+        <w:sz w:val="20"/>
+      </w:rPr>
+    </w:lvl>
+    <w:lvl w:ilvl="2" w:tentative="1">
+      <w:start w:val="1"/>
+      <w:numFmt w:val="bullet"/>
+      <w:lvlText w:val=""/>
+      <w:lvlJc w:val="left"/>
+      <w:pPr>
+        <w:tabs>
+          <w:tab w:val="num" w:pos="2160"/>
+        </w:tabs>
+        <w:ind w:left="2160" w:hanging="360"/>
+      </w:pPr>
+      <w:rPr>
+        <w:rFonts w:ascii="Wingdings" w:hAnsi="Wingdings" w:hint="default"/>
+        <w:sz w:val="20"/>
+      </w:rPr>
+    </w:lvl>
+    <w:lvl w:ilvl="3" w:tentative="1">
+      <w:start w:val="1"/>
+      <w:numFmt w:val="bullet"/>
+      <w:lvlText w:val=""/>
+      <w:lvlJc w:val="left"/>
+      <w:pPr>
+        <w:tabs>
+          <w:tab w:val="num" w:pos="2880"/>
+        </w:tabs>
+        <w:ind w:left="2880" w:hanging="360"/>
+      </w:pPr>
+      <w:rPr>
+        <w:rFonts w:ascii="Wingdings" w:hAnsi="Wingdings" w:hint="default"/>
+        <w:sz w:val="20"/>
+      </w:rPr>
+    </w:lvl>
+    <w:lvl w:ilvl="4" w:tentative="1">
+      <w:start w:val="1"/>
+      <w:numFmt w:val="bullet"/>
+      <w:lvlText w:val=""/>
+      <w:lvlJc w:val="left"/>
+      <w:pPr>
+        <w:tabs>
+          <w:tab w:val="num" w:pos="3600"/>
+        </w:tabs>
+        <w:ind w:left="3600" w:hanging="360"/>
+      </w:pPr>
+      <w:rPr>
+        <w:rFonts w:ascii="Wingdings" w:hAnsi="Wingdings" w:hint="default"/>
+        <w:sz w:val="20"/>
+      </w:rPr>
+    </w:lvl>
+    <w:lvl w:ilvl="5" w:tentative="1">
+      <w:start w:val="1"/>
+      <w:numFmt w:val="bullet"/>
+      <w:lvlText w:val=""/>
+      <w:lvlJc w:val="left"/>
+      <w:pPr>
+        <w:tabs>
+          <w:tab w:val="num" w:pos="4320"/>
+        </w:tabs>
+        <w:ind w:left="4320" w:hanging="360"/>
+      </w:pPr>
+      <w:rPr>
+        <w:rFonts w:ascii="Wingdings" w:hAnsi="Wingdings" w:hint="default"/>
+        <w:sz w:val="20"/>
+      </w:rPr>
+    </w:lvl>
+    <w:lvl w:ilvl="6" w:tentative="1">
+      <w:start w:val="1"/>
+      <w:numFmt w:val="bullet"/>
+      <w:lvlText w:val=""/>
+      <w:lvlJc w:val="left"/>
+      <w:pPr>
+        <w:tabs>
+          <w:tab w:val="num" w:pos="5040"/>
+        </w:tabs>
+        <w:ind w:left="5040" w:hanging="360"/>
+      </w:pPr>
+      <w:rPr>
+        <w:rFonts w:ascii="Wingdings" w:hAnsi="Wingdings" w:hint="default"/>
+        <w:sz w:val="20"/>
+      </w:rPr>
+    </w:lvl>
+    <w:lvl w:ilvl="7" w:tentative="1">
+      <w:start w:val="1"/>
+      <w:numFmt w:val="bullet"/>
+      <w:lvlText w:val=""/>
+      <w:lvlJc w:val="left"/>
+      <w:pPr>
+        <w:tabs>
+          <w:tab w:val="num" w:pos="5760"/>
+        </w:tabs>
+        <w:ind w:left="5760" w:hanging="360"/>
+      </w:pPr>
+      <w:rPr>
+        <w:rFonts w:ascii="Wingdings" w:hAnsi="Wingdings" w:hint="default"/>
+        <w:sz w:val="20"/>
+      </w:rPr>
+    </w:lvl>
+    <w:lvl w:ilvl="8" w:tentative="1">
+      <w:start w:val="1"/>
+      <w:numFmt w:val="bullet"/>
+      <w:lvlText w:val=""/>
+      <w:lvlJc w:val="left"/>
+      <w:pPr>
+        <w:tabs>
+          <w:tab w:val="num" w:pos="6480"/>
+        </w:tabs>
+        <w:ind w:left="6480" w:hanging="360"/>
+      </w:pPr>
+      <w:rPr>
+        <w:rFonts w:ascii="Wingdings" w:hAnsi="Wingdings" w:hint="default"/>
+        <w:sz w:val="20"/>
+      </w:rPr>
+    </w:lvl>
+  </w:abstractNum>
+  <w:abstractNum w:abstractNumId="17" w15:restartNumberingAfterBreak="0">
     <w:nsid w:val="780E04D7"/>
     <w:multiLevelType w:val="hybridMultilevel"/>
     <w:tmpl w:val="AAA02FD2"/>
@@ -40619,7 +41812,7 @@
       </w:rPr>
     </w:lvl>
   </w:abstractNum>
-  <w:abstractNum w:abstractNumId="17" w15:restartNumberingAfterBreak="0">
+  <w:abstractNum w:abstractNumId="18" w15:restartNumberingAfterBreak="0">
     <w:nsid w:val="79306B18"/>
     <w:multiLevelType w:val="hybridMultilevel"/>
     <w:tmpl w:val="B02AD490"/>
@@ -40733,7 +41926,7 @@
     </w:lvl>
   </w:abstractNum>
   <w:num w:numId="1" w16cid:durableId="1264800247">
-    <w:abstractNumId w:val="16"/>
+    <w:abstractNumId w:val="17"/>
   </w:num>
   <w:num w:numId="2" w16cid:durableId="1848666731">
     <w:abstractNumId w:val="12"/>
@@ -40766,7 +41959,7 @@
     <w:abstractNumId w:val="10"/>
   </w:num>
   <w:num w:numId="12" w16cid:durableId="517739745">
-    <w:abstractNumId w:val="17"/>
+    <w:abstractNumId w:val="18"/>
   </w:num>
   <w:num w:numId="13" w16cid:durableId="344672934">
     <w:abstractNumId w:val="0"/>
@@ -40785,6 +41978,9 @@
   </w:num>
   <w:num w:numId="18" w16cid:durableId="1418674079">
     <w:abstractNumId w:val="3"/>
+  </w:num>
+  <w:num w:numId="19" w16cid:durableId="1619992921">
+    <w:abstractNumId w:val="16"/>
   </w:num>
   <w:numIdMacAtCleanup w:val="9"/>
 </w:numbering>
@@ -42257,6 +43453,19 @@
       <w:shd w:val="clear" w:color="auto" w:fill="E1DFDD"/>
     </w:rPr>
   </w:style>
+  <w:style w:type="character" w:styleId="CdigoHTML">
+    <w:name w:val="HTML Code"/>
+    <w:basedOn w:val="Fuentedeprrafopredeter"/>
+    <w:uiPriority w:val="99"/>
+    <w:semiHidden/>
+    <w:unhideWhenUsed/>
+    <w:rsid w:val="002D3A96"/>
+    <w:rPr>
+      <w:rFonts w:ascii="Courier New" w:eastAsia="Times New Roman" w:hAnsi="Courier New" w:cs="Courier New"/>
+      <w:sz w:val="20"/>
+      <w:szCs w:val="20"/>
+    </w:rPr>
+  </w:style>
 </w:styles>
 </file>
 
@@ -42687,7 +43896,6 @@
     <w:rsid w:val="00760466"/>
     <w:rsid w:val="0078114E"/>
     <w:rsid w:val="00783082"/>
-    <w:rsid w:val="007C0FEF"/>
     <w:rsid w:val="007D1778"/>
     <w:rsid w:val="007D7A65"/>
     <w:rsid w:val="007E0BE2"/>
@@ -42725,6 +43933,7 @@
     <w:rsid w:val="00E03F4D"/>
     <w:rsid w:val="00E1070B"/>
     <w:rsid w:val="00E32BA3"/>
+    <w:rsid w:val="00EE651C"/>
     <w:rsid w:val="00F43476"/>
     <w:rsid w:val="00F5150F"/>
     <w:rsid w:val="00FA2BCD"/>

</xml_diff>